<commit_message>
Upload for project due date
</commit_message>
<xml_diff>
--- a/docassemble/MLRILettertoDCFforADA/data/templates/dcf_disability_accommodations.docx
+++ b/docassemble/MLRILettertoDCFforADA/data/templates/dcf_disability_accommodations.docx
@@ -154,36 +154,57 @@
           <w:sz w:val="24"/>
           <w:szCs w:val="24"/>
         </w:rPr>
-        <w:t xml:space="preserve">{{ </w:t>
-      </w:r>
-      <w:proofErr w:type="spellStart"/>
-      <w:r>
-        <w:rPr>
-          <w:rFonts w:ascii="Times New Roman" w:eastAsia="Times New Roman" w:hAnsi="Times New Roman" w:cs="Times New Roman"/>
-          <w:sz w:val="24"/>
-          <w:szCs w:val="24"/>
-        </w:rPr>
-        <w:t>is</w:t>
-      </w:r>
-      <w:proofErr w:type="gramEnd"/>
-      <w:r>
-        <w:rPr>
-          <w:rFonts w:ascii="Times New Roman" w:eastAsia="Times New Roman" w:hAnsi="Times New Roman" w:cs="Times New Roman"/>
-          <w:sz w:val="24"/>
-          <w:szCs w:val="24"/>
-        </w:rPr>
-        <w:t>_diff_par_</w:t>
-      </w:r>
-      <w:proofErr w:type="gramStart"/>
-      <w:r>
-        <w:rPr>
-          <w:rFonts w:ascii="Times New Roman" w:eastAsia="Times New Roman" w:hAnsi="Times New Roman" w:cs="Times New Roman"/>
-          <w:sz w:val="24"/>
-          <w:szCs w:val="24"/>
-        </w:rPr>
-        <w:t>sched</w:t>
-      </w:r>
-      <w:proofErr w:type="spellEnd"/>
+        <w:t>{{</w:t>
+      </w:r>
+      <w:r>
+        <w:t xml:space="preserve"> </w:t>
+      </w:r>
+      <w:proofErr w:type="spellStart"/>
+      <w:r>
+        <w:rPr>
+          <w:rFonts w:ascii="Times New Roman" w:eastAsia="Times New Roman" w:hAnsi="Times New Roman" w:cs="Times New Roman"/>
+          <w:sz w:val="24"/>
+          <w:szCs w:val="24"/>
+        </w:rPr>
+        <w:t>output</w:t>
+      </w:r>
+      <w:proofErr w:type="gramEnd"/>
+      <w:r>
+        <w:rPr>
+          <w:rFonts w:ascii="Times New Roman" w:eastAsia="Times New Roman" w:hAnsi="Times New Roman" w:cs="Times New Roman"/>
+          <w:sz w:val="24"/>
+          <w:szCs w:val="24"/>
+        </w:rPr>
+        <w:t>_checkbox</w:t>
+      </w:r>
+      <w:proofErr w:type="spellEnd"/>
+      <w:r>
+        <w:rPr>
+          <w:rFonts w:ascii="Times New Roman" w:eastAsia="Times New Roman" w:hAnsi="Times New Roman" w:cs="Times New Roman"/>
+          <w:sz w:val="24"/>
+          <w:szCs w:val="24"/>
+        </w:rPr>
+        <w:t>(</w:t>
+      </w:r>
+      <w:proofErr w:type="spellStart"/>
+      <w:r>
+        <w:rPr>
+          <w:rFonts w:ascii="Times New Roman" w:eastAsia="Times New Roman" w:hAnsi="Times New Roman" w:cs="Times New Roman"/>
+          <w:sz w:val="24"/>
+          <w:szCs w:val="24"/>
+        </w:rPr>
+        <w:t>is_diff_par_sched</w:t>
+      </w:r>
+      <w:proofErr w:type="spellEnd"/>
+      <w:proofErr w:type="gramStart"/>
+      <w:r>
+        <w:rPr>
+          <w:rFonts w:ascii="Times New Roman" w:eastAsia="Times New Roman" w:hAnsi="Times New Roman" w:cs="Times New Roman"/>
+          <w:sz w:val="24"/>
+          <w:szCs w:val="24"/>
+        </w:rPr>
+        <w:t>)</w:t>
+      </w:r>
       <w:r>
         <w:rPr>
           <w:rFonts w:ascii="Times New Roman" w:eastAsia="Times New Roman" w:hAnsi="Times New Roman" w:cs="Times New Roman"/>
@@ -245,27 +266,45 @@
           <w:sz w:val="24"/>
           <w:szCs w:val="24"/>
         </w:rPr>
-        <w:t>is</w:t>
-      </w:r>
-      <w:proofErr w:type="gramEnd"/>
-      <w:r>
-        <w:rPr>
-          <w:rFonts w:ascii="Times New Roman" w:eastAsia="Times New Roman" w:hAnsi="Times New Roman" w:cs="Times New Roman"/>
-          <w:sz w:val="24"/>
-          <w:szCs w:val="24"/>
-        </w:rPr>
-        <w:t>_longer_par_</w:t>
-      </w:r>
-      <w:proofErr w:type="gramStart"/>
-      <w:r>
-        <w:rPr>
-          <w:rFonts w:ascii="Times New Roman" w:eastAsia="Times New Roman" w:hAnsi="Times New Roman" w:cs="Times New Roman"/>
-          <w:sz w:val="24"/>
-          <w:szCs w:val="24"/>
-        </w:rPr>
-        <w:t>time</w:t>
-      </w:r>
-      <w:proofErr w:type="spellEnd"/>
+        <w:t>output</w:t>
+      </w:r>
+      <w:proofErr w:type="gramEnd"/>
+      <w:r>
+        <w:rPr>
+          <w:rFonts w:ascii="Times New Roman" w:eastAsia="Times New Roman" w:hAnsi="Times New Roman" w:cs="Times New Roman"/>
+          <w:sz w:val="24"/>
+          <w:szCs w:val="24"/>
+        </w:rPr>
+        <w:t>_checkbox</w:t>
+      </w:r>
+      <w:proofErr w:type="spellEnd"/>
+      <w:r>
+        <w:rPr>
+          <w:rFonts w:ascii="Times New Roman" w:eastAsia="Times New Roman" w:hAnsi="Times New Roman" w:cs="Times New Roman"/>
+          <w:sz w:val="24"/>
+          <w:szCs w:val="24"/>
+        </w:rPr>
+        <w:t>(</w:t>
+      </w:r>
+      <w:proofErr w:type="spellStart"/>
+      <w:r>
+        <w:rPr>
+          <w:rFonts w:ascii="Times New Roman" w:eastAsia="Times New Roman" w:hAnsi="Times New Roman" w:cs="Times New Roman"/>
+          <w:sz w:val="24"/>
+          <w:szCs w:val="24"/>
+        </w:rPr>
+        <w:t>is_longer_par_time</w:t>
+      </w:r>
+      <w:proofErr w:type="spellEnd"/>
+      <w:proofErr w:type="gramStart"/>
+      <w:r>
+        <w:rPr>
+          <w:rFonts w:ascii="Times New Roman" w:eastAsia="Times New Roman" w:hAnsi="Times New Roman" w:cs="Times New Roman"/>
+          <w:sz w:val="24"/>
+          <w:szCs w:val="24"/>
+        </w:rPr>
+        <w:t>)</w:t>
+      </w:r>
       <w:r>
         <w:rPr>
           <w:rFonts w:ascii="Times New Roman" w:eastAsia="Times New Roman" w:hAnsi="Times New Roman" w:cs="Times New Roman"/>
@@ -289,7 +328,23 @@
           <w:sz w:val="24"/>
           <w:szCs w:val="24"/>
         </w:rPr>
-        <w:t xml:space="preserve"> longer parenting </w:t>
+        <w:t xml:space="preserve"> longer</w:t>
+      </w:r>
+      <w:r>
+        <w:rPr>
+          <w:rFonts w:ascii="Times New Roman" w:eastAsia="Times New Roman" w:hAnsi="Times New Roman" w:cs="Times New Roman"/>
+          <w:sz w:val="24"/>
+          <w:szCs w:val="24"/>
+        </w:rPr>
+        <w:t xml:space="preserve"> </w:t>
+      </w:r>
+      <w:r>
+        <w:rPr>
+          <w:rFonts w:ascii="Times New Roman" w:eastAsia="Times New Roman" w:hAnsi="Times New Roman" w:cs="Times New Roman"/>
+          <w:sz w:val="24"/>
+          <w:szCs w:val="24"/>
+        </w:rPr>
+        <w:t xml:space="preserve">parenting </w:t>
       </w:r>
       <w:proofErr w:type="gramStart"/>
       <w:r>
@@ -327,27 +382,45 @@
           <w:sz w:val="24"/>
           <w:szCs w:val="24"/>
         </w:rPr>
-        <w:t>is</w:t>
-      </w:r>
-      <w:proofErr w:type="gramEnd"/>
-      <w:r>
-        <w:rPr>
-          <w:rFonts w:ascii="Times New Roman" w:eastAsia="Times New Roman" w:hAnsi="Times New Roman" w:cs="Times New Roman"/>
-          <w:sz w:val="24"/>
-          <w:szCs w:val="24"/>
-        </w:rPr>
-        <w:t>_shorter_par_</w:t>
-      </w:r>
-      <w:proofErr w:type="gramStart"/>
-      <w:r>
-        <w:rPr>
-          <w:rFonts w:ascii="Times New Roman" w:eastAsia="Times New Roman" w:hAnsi="Times New Roman" w:cs="Times New Roman"/>
-          <w:sz w:val="24"/>
-          <w:szCs w:val="24"/>
-        </w:rPr>
-        <w:t>time</w:t>
-      </w:r>
-      <w:proofErr w:type="spellEnd"/>
+        <w:t>output</w:t>
+      </w:r>
+      <w:proofErr w:type="gramEnd"/>
+      <w:r>
+        <w:rPr>
+          <w:rFonts w:ascii="Times New Roman" w:eastAsia="Times New Roman" w:hAnsi="Times New Roman" w:cs="Times New Roman"/>
+          <w:sz w:val="24"/>
+          <w:szCs w:val="24"/>
+        </w:rPr>
+        <w:t>_checkbox</w:t>
+      </w:r>
+      <w:proofErr w:type="spellEnd"/>
+      <w:r>
+        <w:rPr>
+          <w:rFonts w:ascii="Times New Roman" w:eastAsia="Times New Roman" w:hAnsi="Times New Roman" w:cs="Times New Roman"/>
+          <w:sz w:val="24"/>
+          <w:szCs w:val="24"/>
+        </w:rPr>
+        <w:t>(</w:t>
+      </w:r>
+      <w:proofErr w:type="spellStart"/>
+      <w:r>
+        <w:rPr>
+          <w:rFonts w:ascii="Times New Roman" w:eastAsia="Times New Roman" w:hAnsi="Times New Roman" w:cs="Times New Roman"/>
+          <w:sz w:val="24"/>
+          <w:szCs w:val="24"/>
+        </w:rPr>
+        <w:t>is_shorter_par_time</w:t>
+      </w:r>
+      <w:proofErr w:type="spellEnd"/>
+      <w:proofErr w:type="gramStart"/>
+      <w:r>
+        <w:rPr>
+          <w:rFonts w:ascii="Times New Roman" w:eastAsia="Times New Roman" w:hAnsi="Times New Roman" w:cs="Times New Roman"/>
+          <w:sz w:val="24"/>
+          <w:szCs w:val="24"/>
+        </w:rPr>
+        <w:t>)</w:t>
+      </w:r>
       <w:r>
         <w:rPr>
           <w:rFonts w:ascii="Times New Roman" w:eastAsia="Times New Roman" w:hAnsi="Times New Roman" w:cs="Times New Roman"/>
@@ -400,7 +473,59 @@
           <w:sz w:val="24"/>
           <w:szCs w:val="24"/>
         </w:rPr>
-        <w:t xml:space="preserve">{{ </w:t>
+        <w:t>{{</w:t>
+      </w:r>
+      <w:r>
+        <w:rPr>
+          <w:rFonts w:ascii="Times New Roman" w:eastAsia="Times New Roman" w:hAnsi="Times New Roman" w:cs="Times New Roman"/>
+          <w:sz w:val="24"/>
+          <w:szCs w:val="24"/>
+        </w:rPr>
+        <w:t xml:space="preserve"> </w:t>
+      </w:r>
+      <w:proofErr w:type="spellStart"/>
+      <w:r>
+        <w:rPr>
+          <w:rFonts w:ascii="Times New Roman" w:eastAsia="Times New Roman" w:hAnsi="Times New Roman" w:cs="Times New Roman"/>
+          <w:sz w:val="24"/>
+          <w:szCs w:val="24"/>
+        </w:rPr>
+        <w:t>output</w:t>
+      </w:r>
+      <w:proofErr w:type="gramEnd"/>
+      <w:r>
+        <w:rPr>
+          <w:rFonts w:ascii="Times New Roman" w:eastAsia="Times New Roman" w:hAnsi="Times New Roman" w:cs="Times New Roman"/>
+          <w:sz w:val="24"/>
+          <w:szCs w:val="24"/>
+        </w:rPr>
+        <w:t>_</w:t>
+      </w:r>
+      <w:proofErr w:type="gramStart"/>
+      <w:r>
+        <w:rPr>
+          <w:rFonts w:ascii="Times New Roman" w:eastAsia="Times New Roman" w:hAnsi="Times New Roman" w:cs="Times New Roman"/>
+          <w:sz w:val="24"/>
+          <w:szCs w:val="24"/>
+        </w:rPr>
+        <w:t>checkbox</w:t>
+      </w:r>
+      <w:proofErr w:type="spellEnd"/>
+      <w:r>
+        <w:rPr>
+          <w:rFonts w:ascii="Times New Roman" w:eastAsia="Times New Roman" w:hAnsi="Times New Roman" w:cs="Times New Roman"/>
+          <w:sz w:val="24"/>
+          <w:szCs w:val="24"/>
+        </w:rPr>
+        <w:t>(</w:t>
+      </w:r>
+      <w:r>
+        <w:rPr>
+          <w:rFonts w:ascii="Times New Roman" w:eastAsia="Times New Roman" w:hAnsi="Times New Roman" w:cs="Times New Roman"/>
+          <w:sz w:val="24"/>
+          <w:szCs w:val="24"/>
+        </w:rPr>
+        <w:t xml:space="preserve"> </w:t>
       </w:r>
       <w:proofErr w:type="spellStart"/>
       <w:r>
@@ -418,18 +543,18 @@
           <w:sz w:val="24"/>
           <w:szCs w:val="24"/>
         </w:rPr>
-        <w:t>_diff_</w:t>
-      </w:r>
-      <w:proofErr w:type="gramStart"/>
-      <w:r>
-        <w:rPr>
-          <w:rFonts w:ascii="Times New Roman" w:eastAsia="Times New Roman" w:hAnsi="Times New Roman" w:cs="Times New Roman"/>
-          <w:sz w:val="24"/>
-          <w:szCs w:val="24"/>
-        </w:rPr>
-        <w:t>loc</w:t>
-      </w:r>
-      <w:proofErr w:type="spellEnd"/>
+        <w:t>_diff_loc</w:t>
+      </w:r>
+      <w:proofErr w:type="spellEnd"/>
+      <w:proofErr w:type="gramStart"/>
+      <w:r>
+        <w:rPr>
+          <w:rFonts w:ascii="Times New Roman" w:eastAsia="Times New Roman" w:hAnsi="Times New Roman" w:cs="Times New Roman"/>
+          <w:sz w:val="24"/>
+          <w:szCs w:val="24"/>
+        </w:rPr>
+        <w:t>)</w:t>
+      </w:r>
       <w:r>
         <w:rPr>
           <w:rFonts w:ascii="Times New Roman" w:eastAsia="Times New Roman" w:hAnsi="Times New Roman" w:cs="Times New Roman"/>
@@ -491,27 +616,45 @@
           <w:sz w:val="24"/>
           <w:szCs w:val="24"/>
         </w:rPr>
-        <w:t>is</w:t>
-      </w:r>
-      <w:proofErr w:type="gramEnd"/>
-      <w:r>
-        <w:rPr>
-          <w:rFonts w:ascii="Times New Roman" w:eastAsia="Times New Roman" w:hAnsi="Times New Roman" w:cs="Times New Roman"/>
-          <w:sz w:val="24"/>
-          <w:szCs w:val="24"/>
-        </w:rPr>
-        <w:t>_handson_learning_</w:t>
-      </w:r>
-      <w:proofErr w:type="gramStart"/>
-      <w:r>
-        <w:rPr>
-          <w:rFonts w:ascii="Times New Roman" w:eastAsia="Times New Roman" w:hAnsi="Times New Roman" w:cs="Times New Roman"/>
-          <w:sz w:val="24"/>
-          <w:szCs w:val="24"/>
-        </w:rPr>
-        <w:t>med</w:t>
-      </w:r>
-      <w:proofErr w:type="spellEnd"/>
+        <w:t>output</w:t>
+      </w:r>
+      <w:proofErr w:type="gramEnd"/>
+      <w:r>
+        <w:rPr>
+          <w:rFonts w:ascii="Times New Roman" w:eastAsia="Times New Roman" w:hAnsi="Times New Roman" w:cs="Times New Roman"/>
+          <w:sz w:val="24"/>
+          <w:szCs w:val="24"/>
+        </w:rPr>
+        <w:t>_checkbox</w:t>
+      </w:r>
+      <w:proofErr w:type="spellEnd"/>
+      <w:r>
+        <w:rPr>
+          <w:rFonts w:ascii="Times New Roman" w:eastAsia="Times New Roman" w:hAnsi="Times New Roman" w:cs="Times New Roman"/>
+          <w:sz w:val="24"/>
+          <w:szCs w:val="24"/>
+        </w:rPr>
+        <w:t>(</w:t>
+      </w:r>
+      <w:proofErr w:type="spellStart"/>
+      <w:r>
+        <w:rPr>
+          <w:rFonts w:ascii="Times New Roman" w:eastAsia="Times New Roman" w:hAnsi="Times New Roman" w:cs="Times New Roman"/>
+          <w:sz w:val="24"/>
+          <w:szCs w:val="24"/>
+        </w:rPr>
+        <w:t>is_handson_learning_med</w:t>
+      </w:r>
+      <w:proofErr w:type="spellEnd"/>
+      <w:proofErr w:type="gramStart"/>
+      <w:r>
+        <w:rPr>
+          <w:rFonts w:ascii="Times New Roman" w:eastAsia="Times New Roman" w:hAnsi="Times New Roman" w:cs="Times New Roman"/>
+          <w:sz w:val="24"/>
+          <w:szCs w:val="24"/>
+        </w:rPr>
+        <w:t>)</w:t>
+      </w:r>
       <w:r>
         <w:rPr>
           <w:rFonts w:ascii="Times New Roman" w:eastAsia="Times New Roman" w:hAnsi="Times New Roman" w:cs="Times New Roman"/>
@@ -573,35 +716,45 @@
           <w:sz w:val="24"/>
           <w:szCs w:val="24"/>
         </w:rPr>
-        <w:t>is</w:t>
-      </w:r>
-      <w:proofErr w:type="gramEnd"/>
-      <w:r>
-        <w:rPr>
-          <w:rFonts w:ascii="Times New Roman" w:eastAsia="Times New Roman" w:hAnsi="Times New Roman" w:cs="Times New Roman"/>
-          <w:sz w:val="24"/>
-          <w:szCs w:val="24"/>
-        </w:rPr>
-        <w:t>_change_taught_par_skills</w:t>
-      </w:r>
-      <w:r>
-        <w:rPr>
-          <w:rFonts w:ascii="Times New Roman" w:eastAsia="Times New Roman" w:hAnsi="Times New Roman" w:cs="Times New Roman"/>
-          <w:sz w:val="24"/>
-          <w:szCs w:val="24"/>
-        </w:rPr>
-        <w:t>_</w:t>
-      </w:r>
-      <w:proofErr w:type="gramStart"/>
-      <w:r>
-        <w:rPr>
-          <w:rFonts w:ascii="Times New Roman" w:eastAsia="Times New Roman" w:hAnsi="Times New Roman" w:cs="Times New Roman"/>
-          <w:sz w:val="24"/>
-          <w:szCs w:val="24"/>
-        </w:rPr>
-        <w:t>any</w:t>
-      </w:r>
-      <w:proofErr w:type="spellEnd"/>
+        <w:t>output</w:t>
+      </w:r>
+      <w:proofErr w:type="gramEnd"/>
+      <w:r>
+        <w:rPr>
+          <w:rFonts w:ascii="Times New Roman" w:eastAsia="Times New Roman" w:hAnsi="Times New Roman" w:cs="Times New Roman"/>
+          <w:sz w:val="24"/>
+          <w:szCs w:val="24"/>
+        </w:rPr>
+        <w:t>_checkbox</w:t>
+      </w:r>
+      <w:proofErr w:type="spellEnd"/>
+      <w:r>
+        <w:rPr>
+          <w:rFonts w:ascii="Times New Roman" w:eastAsia="Times New Roman" w:hAnsi="Times New Roman" w:cs="Times New Roman"/>
+          <w:sz w:val="24"/>
+          <w:szCs w:val="24"/>
+        </w:rPr>
+        <w:t>(</w:t>
+      </w:r>
+      <w:proofErr w:type="spellStart"/>
+      <w:r>
+        <w:rPr>
+          <w:rFonts w:ascii="Times New Roman" w:eastAsia="Times New Roman" w:hAnsi="Times New Roman" w:cs="Times New Roman"/>
+          <w:sz w:val="24"/>
+          <w:szCs w:val="24"/>
+        </w:rPr>
+        <w:t>is_change_letters_written_simpler</w:t>
+      </w:r>
+      <w:proofErr w:type="spellEnd"/>
+      <w:proofErr w:type="gramStart"/>
+      <w:r>
+        <w:rPr>
+          <w:rFonts w:ascii="Times New Roman" w:eastAsia="Times New Roman" w:hAnsi="Times New Roman" w:cs="Times New Roman"/>
+          <w:sz w:val="24"/>
+          <w:szCs w:val="24"/>
+        </w:rPr>
+        <w:t>)</w:t>
+      </w:r>
       <w:r>
         <w:rPr>
           <w:rFonts w:ascii="Times New Roman" w:eastAsia="Times New Roman" w:hAnsi="Times New Roman" w:cs="Times New Roman"/>
@@ -625,8 +778,18 @@
           <w:sz w:val="24"/>
           <w:szCs w:val="24"/>
         </w:rPr>
-        <w:t xml:space="preserve"> a change in how I am being taught parenting skills, specifically </w:t>
-      </w:r>
+        <w:t xml:space="preserve"> letters and DCF action plans that are written in a way that are easier to </w:t>
+      </w:r>
+      <w:proofErr w:type="gramStart"/>
+      <w:r>
+        <w:rPr>
+          <w:rFonts w:ascii="Times New Roman" w:eastAsia="Times New Roman" w:hAnsi="Times New Roman" w:cs="Times New Roman"/>
+          <w:sz w:val="24"/>
+          <w:szCs w:val="24"/>
+        </w:rPr>
+        <w:t>understand;</w:t>
+      </w:r>
+      <w:proofErr w:type="gramEnd"/>
     </w:p>
     <w:p>
       <w:pPr>
@@ -653,62 +816,88 @@
           <w:sz w:val="24"/>
           <w:szCs w:val="24"/>
         </w:rPr>
-        <w:t>is</w:t>
-      </w:r>
-      <w:proofErr w:type="gramEnd"/>
-      <w:r>
-        <w:rPr>
-          <w:rFonts w:ascii="Times New Roman" w:eastAsia="Times New Roman" w:hAnsi="Times New Roman" w:cs="Times New Roman"/>
-          <w:sz w:val="24"/>
-          <w:szCs w:val="24"/>
-        </w:rPr>
-        <w:t>_change_letters_written_</w:t>
-      </w:r>
-      <w:proofErr w:type="gramStart"/>
-      <w:r>
-        <w:rPr>
-          <w:rFonts w:ascii="Times New Roman" w:eastAsia="Times New Roman" w:hAnsi="Times New Roman" w:cs="Times New Roman"/>
-          <w:sz w:val="24"/>
-          <w:szCs w:val="24"/>
-        </w:rPr>
-        <w:t>simpler</w:t>
-      </w:r>
-      <w:proofErr w:type="spellEnd"/>
-      <w:r>
-        <w:rPr>
-          <w:rFonts w:ascii="Times New Roman" w:eastAsia="Times New Roman" w:hAnsi="Times New Roman" w:cs="Times New Roman"/>
-          <w:sz w:val="24"/>
-          <w:szCs w:val="24"/>
-        </w:rPr>
-        <w:t xml:space="preserve"> }</w:t>
-      </w:r>
-      <w:proofErr w:type="gramEnd"/>
-      <w:r>
-        <w:rPr>
-          <w:rFonts w:ascii="Times New Roman" w:eastAsia="Times New Roman" w:hAnsi="Times New Roman" w:cs="Times New Roman"/>
-          <w:sz w:val="24"/>
-          <w:szCs w:val="24"/>
-        </w:rPr>
-        <w:t>}</w:t>
-      </w:r>
-      <w:r>
-        <w:rPr>
-          <w:rFonts w:ascii="Times New Roman" w:eastAsia="Times New Roman" w:hAnsi="Times New Roman" w:cs="Times New Roman"/>
-          <w:sz w:val="24"/>
-          <w:szCs w:val="24"/>
-        </w:rPr>
-        <w:t xml:space="preserve"> letters and DCF action plans that are written in a way that are easier to </w:t>
-      </w:r>
-      <w:proofErr w:type="gramStart"/>
-      <w:r>
-        <w:rPr>
-          <w:rFonts w:ascii="Times New Roman" w:eastAsia="Times New Roman" w:hAnsi="Times New Roman" w:cs="Times New Roman"/>
-          <w:sz w:val="24"/>
-          <w:szCs w:val="24"/>
-        </w:rPr>
-        <w:t>understand;</w:t>
-      </w:r>
-      <w:proofErr w:type="gramEnd"/>
+        <w:t>output</w:t>
+      </w:r>
+      <w:proofErr w:type="gramEnd"/>
+      <w:r>
+        <w:rPr>
+          <w:rFonts w:ascii="Times New Roman" w:eastAsia="Times New Roman" w:hAnsi="Times New Roman" w:cs="Times New Roman"/>
+          <w:sz w:val="24"/>
+          <w:szCs w:val="24"/>
+        </w:rPr>
+        <w:t>_checkbox</w:t>
+      </w:r>
+      <w:proofErr w:type="spellEnd"/>
+      <w:r>
+        <w:rPr>
+          <w:rFonts w:ascii="Times New Roman" w:eastAsia="Times New Roman" w:hAnsi="Times New Roman" w:cs="Times New Roman"/>
+          <w:sz w:val="24"/>
+          <w:szCs w:val="24"/>
+        </w:rPr>
+        <w:t>(</w:t>
+      </w:r>
+      <w:proofErr w:type="spellStart"/>
+      <w:r>
+        <w:rPr>
+          <w:rFonts w:ascii="Times New Roman" w:eastAsia="Times New Roman" w:hAnsi="Times New Roman" w:cs="Times New Roman"/>
+          <w:sz w:val="24"/>
+          <w:szCs w:val="24"/>
+        </w:rPr>
+        <w:t>is_written_summary</w:t>
+      </w:r>
+      <w:proofErr w:type="spellEnd"/>
+      <w:proofErr w:type="gramStart"/>
+      <w:r>
+        <w:rPr>
+          <w:rFonts w:ascii="Times New Roman" w:eastAsia="Times New Roman" w:hAnsi="Times New Roman" w:cs="Times New Roman"/>
+          <w:sz w:val="24"/>
+          <w:szCs w:val="24"/>
+        </w:rPr>
+        <w:t>)</w:t>
+      </w:r>
+      <w:r>
+        <w:rPr>
+          <w:rFonts w:ascii="Times New Roman" w:eastAsia="Times New Roman" w:hAnsi="Times New Roman" w:cs="Times New Roman"/>
+          <w:sz w:val="24"/>
+          <w:szCs w:val="24"/>
+        </w:rPr>
+        <w:t xml:space="preserve"> }}</w:t>
+      </w:r>
+      <w:r>
+        <w:rPr>
+          <w:rFonts w:ascii="Times New Roman" w:eastAsia="Times New Roman" w:hAnsi="Times New Roman" w:cs="Times New Roman"/>
+          <w:sz w:val="24"/>
+          <w:szCs w:val="24"/>
+        </w:rPr>
+        <w:t>a</w:t>
+      </w:r>
+      <w:proofErr w:type="gramEnd"/>
+      <w:r>
+        <w:rPr>
+          <w:rFonts w:ascii="Times New Roman" w:eastAsia="Times New Roman" w:hAnsi="Times New Roman" w:cs="Times New Roman"/>
+          <w:sz w:val="24"/>
+          <w:szCs w:val="24"/>
+        </w:rPr>
+        <w:t xml:space="preserve"> written summary of any meeting with DCF or its </w:t>
+      </w:r>
+      <w:proofErr w:type="gramStart"/>
+      <w:r>
+        <w:rPr>
+          <w:rFonts w:ascii="Times New Roman" w:eastAsia="Times New Roman" w:hAnsi="Times New Roman" w:cs="Times New Roman"/>
+          <w:sz w:val="24"/>
+          <w:szCs w:val="24"/>
+        </w:rPr>
+        <w:t>contractors;</w:t>
+      </w:r>
+      <w:proofErr w:type="gramEnd"/>
+      <w:r>
+        <w:rPr>
+          <w:rFonts w:ascii="Times New Roman" w:eastAsia="Times New Roman" w:hAnsi="Times New Roman" w:cs="Times New Roman"/>
+          <w:sz w:val="24"/>
+          <w:szCs w:val="24"/>
+        </w:rPr>
+        <w:t xml:space="preserve"> </w:t>
+      </w:r>
     </w:p>
     <w:p>
       <w:pPr>
@@ -735,35 +924,45 @@
           <w:sz w:val="24"/>
           <w:szCs w:val="24"/>
         </w:rPr>
-        <w:t>is</w:t>
-      </w:r>
-      <w:proofErr w:type="gramEnd"/>
-      <w:r>
-        <w:rPr>
-          <w:rFonts w:ascii="Times New Roman" w:eastAsia="Times New Roman" w:hAnsi="Times New Roman" w:cs="Times New Roman"/>
-          <w:sz w:val="24"/>
-          <w:szCs w:val="24"/>
-        </w:rPr>
-        <w:t>_adaptive_equipment</w:t>
-      </w:r>
-      <w:r>
-        <w:rPr>
-          <w:rFonts w:ascii="Times New Roman" w:eastAsia="Times New Roman" w:hAnsi="Times New Roman" w:cs="Times New Roman"/>
-          <w:sz w:val="24"/>
-          <w:szCs w:val="24"/>
-        </w:rPr>
-        <w:t>_</w:t>
-      </w:r>
-      <w:proofErr w:type="gramStart"/>
-      <w:r>
-        <w:rPr>
-          <w:rFonts w:ascii="Times New Roman" w:eastAsia="Times New Roman" w:hAnsi="Times New Roman" w:cs="Times New Roman"/>
-          <w:sz w:val="24"/>
-          <w:szCs w:val="24"/>
-        </w:rPr>
-        <w:t>any</w:t>
-      </w:r>
-      <w:proofErr w:type="spellEnd"/>
+        <w:t>output</w:t>
+      </w:r>
+      <w:proofErr w:type="gramEnd"/>
+      <w:r>
+        <w:rPr>
+          <w:rFonts w:ascii="Times New Roman" w:eastAsia="Times New Roman" w:hAnsi="Times New Roman" w:cs="Times New Roman"/>
+          <w:sz w:val="24"/>
+          <w:szCs w:val="24"/>
+        </w:rPr>
+        <w:t>_checkbox</w:t>
+      </w:r>
+      <w:proofErr w:type="spellEnd"/>
+      <w:r>
+        <w:rPr>
+          <w:rFonts w:ascii="Times New Roman" w:eastAsia="Times New Roman" w:hAnsi="Times New Roman" w:cs="Times New Roman"/>
+          <w:sz w:val="24"/>
+          <w:szCs w:val="24"/>
+        </w:rPr>
+        <w:t>(</w:t>
+      </w:r>
+      <w:proofErr w:type="spellStart"/>
+      <w:r>
+        <w:rPr>
+          <w:rFonts w:ascii="Times New Roman" w:eastAsia="Times New Roman" w:hAnsi="Times New Roman" w:cs="Times New Roman"/>
+          <w:sz w:val="24"/>
+          <w:szCs w:val="24"/>
+        </w:rPr>
+        <w:t>is_appointment_reminders</w:t>
+      </w:r>
+      <w:proofErr w:type="spellEnd"/>
+      <w:proofErr w:type="gramStart"/>
+      <w:r>
+        <w:rPr>
+          <w:rFonts w:ascii="Times New Roman" w:eastAsia="Times New Roman" w:hAnsi="Times New Roman" w:cs="Times New Roman"/>
+          <w:sz w:val="24"/>
+          <w:szCs w:val="24"/>
+        </w:rPr>
+        <w:t>)</w:t>
+      </w:r>
       <w:r>
         <w:rPr>
           <w:rFonts w:ascii="Times New Roman" w:eastAsia="Times New Roman" w:hAnsi="Times New Roman" w:cs="Times New Roman"/>
@@ -787,8 +986,18 @@
           <w:sz w:val="24"/>
           <w:szCs w:val="24"/>
         </w:rPr>
-        <w:t xml:space="preserve"> adaptive parenting equipment, such as </w:t>
-      </w:r>
+        <w:t xml:space="preserve"> calls or emails to remind me of my </w:t>
+      </w:r>
+      <w:proofErr w:type="gramStart"/>
+      <w:r>
+        <w:rPr>
+          <w:rFonts w:ascii="Times New Roman" w:eastAsia="Times New Roman" w:hAnsi="Times New Roman" w:cs="Times New Roman"/>
+          <w:sz w:val="24"/>
+          <w:szCs w:val="24"/>
+        </w:rPr>
+        <w:t>appointments;</w:t>
+      </w:r>
+      <w:proofErr w:type="gramEnd"/>
     </w:p>
     <w:p>
       <w:pPr>
@@ -815,70 +1024,80 @@
           <w:sz w:val="24"/>
           <w:szCs w:val="24"/>
         </w:rPr>
-        <w:t>is</w:t>
-      </w:r>
-      <w:proofErr w:type="gramEnd"/>
-      <w:r>
-        <w:rPr>
-          <w:rFonts w:ascii="Times New Roman" w:eastAsia="Times New Roman" w:hAnsi="Times New Roman" w:cs="Times New Roman"/>
-          <w:sz w:val="24"/>
-          <w:szCs w:val="24"/>
-        </w:rPr>
-        <w:t>_written_</w:t>
-      </w:r>
-      <w:proofErr w:type="gramStart"/>
-      <w:r>
-        <w:rPr>
-          <w:rFonts w:ascii="Times New Roman" w:eastAsia="Times New Roman" w:hAnsi="Times New Roman" w:cs="Times New Roman"/>
-          <w:sz w:val="24"/>
-          <w:szCs w:val="24"/>
-        </w:rPr>
-        <w:t>summary</w:t>
-      </w:r>
-      <w:proofErr w:type="spellEnd"/>
-      <w:r>
-        <w:rPr>
-          <w:rFonts w:ascii="Times New Roman" w:eastAsia="Times New Roman" w:hAnsi="Times New Roman" w:cs="Times New Roman"/>
-          <w:sz w:val="24"/>
-          <w:szCs w:val="24"/>
-        </w:rPr>
-        <w:t xml:space="preserve"> }}</w:t>
-      </w:r>
-      <w:r>
-        <w:rPr>
-          <w:rFonts w:ascii="Times New Roman" w:eastAsia="Times New Roman" w:hAnsi="Times New Roman" w:cs="Times New Roman"/>
-          <w:sz w:val="24"/>
-          <w:szCs w:val="24"/>
-        </w:rPr>
-        <w:t>a</w:t>
-      </w:r>
-      <w:proofErr w:type="gramEnd"/>
-      <w:r>
-        <w:rPr>
-          <w:rFonts w:ascii="Times New Roman" w:eastAsia="Times New Roman" w:hAnsi="Times New Roman" w:cs="Times New Roman"/>
-          <w:sz w:val="24"/>
-          <w:szCs w:val="24"/>
-        </w:rPr>
-        <w:t xml:space="preserve"> written summary of any meeting with DCF or its </w:t>
-      </w:r>
-      <w:proofErr w:type="gramStart"/>
-      <w:r>
-        <w:rPr>
-          <w:rFonts w:ascii="Times New Roman" w:eastAsia="Times New Roman" w:hAnsi="Times New Roman" w:cs="Times New Roman"/>
-          <w:sz w:val="24"/>
-          <w:szCs w:val="24"/>
-        </w:rPr>
-        <w:t>contractors;</w:t>
-      </w:r>
-      <w:proofErr w:type="gramEnd"/>
-      <w:r>
-        <w:rPr>
-          <w:rFonts w:ascii="Times New Roman" w:eastAsia="Times New Roman" w:hAnsi="Times New Roman" w:cs="Times New Roman"/>
-          <w:sz w:val="24"/>
-          <w:szCs w:val="24"/>
-        </w:rPr>
-        <w:t xml:space="preserve"> </w:t>
-      </w:r>
+        <w:t>output</w:t>
+      </w:r>
+      <w:proofErr w:type="gramEnd"/>
+      <w:r>
+        <w:rPr>
+          <w:rFonts w:ascii="Times New Roman" w:eastAsia="Times New Roman" w:hAnsi="Times New Roman" w:cs="Times New Roman"/>
+          <w:sz w:val="24"/>
+          <w:szCs w:val="24"/>
+        </w:rPr>
+        <w:t>_checkbox</w:t>
+      </w:r>
+      <w:proofErr w:type="spellEnd"/>
+      <w:r>
+        <w:rPr>
+          <w:rFonts w:ascii="Times New Roman" w:eastAsia="Times New Roman" w:hAnsi="Times New Roman" w:cs="Times New Roman"/>
+          <w:sz w:val="24"/>
+          <w:szCs w:val="24"/>
+        </w:rPr>
+        <w:t>(</w:t>
+      </w:r>
+      <w:proofErr w:type="spellStart"/>
+      <w:r>
+        <w:rPr>
+          <w:rFonts w:ascii="Times New Roman" w:eastAsia="Times New Roman" w:hAnsi="Times New Roman" w:cs="Times New Roman"/>
+          <w:sz w:val="24"/>
+          <w:szCs w:val="24"/>
+        </w:rPr>
+        <w:t>is_visual_calendar</w:t>
+      </w:r>
+      <w:proofErr w:type="spellEnd"/>
+      <w:proofErr w:type="gramStart"/>
+      <w:r>
+        <w:rPr>
+          <w:rFonts w:ascii="Times New Roman" w:eastAsia="Times New Roman" w:hAnsi="Times New Roman" w:cs="Times New Roman"/>
+          <w:sz w:val="24"/>
+          <w:szCs w:val="24"/>
+        </w:rPr>
+        <w:t>)</w:t>
+      </w:r>
+      <w:r>
+        <w:rPr>
+          <w:rFonts w:ascii="Times New Roman" w:eastAsia="Times New Roman" w:hAnsi="Times New Roman" w:cs="Times New Roman"/>
+          <w:sz w:val="24"/>
+          <w:szCs w:val="24"/>
+        </w:rPr>
+        <w:t xml:space="preserve"> }</w:t>
+      </w:r>
+      <w:proofErr w:type="gramEnd"/>
+      <w:r>
+        <w:rPr>
+          <w:rFonts w:ascii="Times New Roman" w:eastAsia="Times New Roman" w:hAnsi="Times New Roman" w:cs="Times New Roman"/>
+          <w:sz w:val="24"/>
+          <w:szCs w:val="24"/>
+        </w:rPr>
+        <w:t>}</w:t>
+      </w:r>
+      <w:r>
+        <w:rPr>
+          <w:rFonts w:ascii="Times New Roman" w:eastAsia="Times New Roman" w:hAnsi="Times New Roman" w:cs="Times New Roman"/>
+          <w:sz w:val="24"/>
+          <w:szCs w:val="24"/>
+        </w:rPr>
+        <w:t xml:space="preserve"> a visual calendar with my appointments, meetings, and parenting time schedules that I can hang on my </w:t>
+      </w:r>
+      <w:proofErr w:type="gramStart"/>
+      <w:r>
+        <w:rPr>
+          <w:rFonts w:ascii="Times New Roman" w:eastAsia="Times New Roman" w:hAnsi="Times New Roman" w:cs="Times New Roman"/>
+          <w:sz w:val="24"/>
+          <w:szCs w:val="24"/>
+        </w:rPr>
+        <w:t>wall;</w:t>
+      </w:r>
+      <w:proofErr w:type="gramEnd"/>
     </w:p>
     <w:p>
       <w:pPr>
@@ -905,27 +1124,45 @@
           <w:sz w:val="24"/>
           <w:szCs w:val="24"/>
         </w:rPr>
-        <w:t>is</w:t>
-      </w:r>
-      <w:proofErr w:type="gramEnd"/>
-      <w:r>
-        <w:rPr>
-          <w:rFonts w:ascii="Times New Roman" w:eastAsia="Times New Roman" w:hAnsi="Times New Roman" w:cs="Times New Roman"/>
-          <w:sz w:val="24"/>
-          <w:szCs w:val="24"/>
-        </w:rPr>
-        <w:t>_appointment_</w:t>
-      </w:r>
-      <w:proofErr w:type="gramStart"/>
-      <w:r>
-        <w:rPr>
-          <w:rFonts w:ascii="Times New Roman" w:eastAsia="Times New Roman" w:hAnsi="Times New Roman" w:cs="Times New Roman"/>
-          <w:sz w:val="24"/>
-          <w:szCs w:val="24"/>
-        </w:rPr>
-        <w:t>reminders</w:t>
-      </w:r>
-      <w:proofErr w:type="spellEnd"/>
+        <w:t>output</w:t>
+      </w:r>
+      <w:proofErr w:type="gramEnd"/>
+      <w:r>
+        <w:rPr>
+          <w:rFonts w:ascii="Times New Roman" w:eastAsia="Times New Roman" w:hAnsi="Times New Roman" w:cs="Times New Roman"/>
+          <w:sz w:val="24"/>
+          <w:szCs w:val="24"/>
+        </w:rPr>
+        <w:t>_checkbox</w:t>
+      </w:r>
+      <w:proofErr w:type="spellEnd"/>
+      <w:r>
+        <w:rPr>
+          <w:rFonts w:ascii="Times New Roman" w:eastAsia="Times New Roman" w:hAnsi="Times New Roman" w:cs="Times New Roman"/>
+          <w:sz w:val="24"/>
+          <w:szCs w:val="24"/>
+        </w:rPr>
+        <w:t>(</w:t>
+      </w:r>
+      <w:proofErr w:type="spellStart"/>
+      <w:r>
+        <w:rPr>
+          <w:rFonts w:ascii="Times New Roman" w:eastAsia="Times New Roman" w:hAnsi="Times New Roman" w:cs="Times New Roman"/>
+          <w:sz w:val="24"/>
+          <w:szCs w:val="24"/>
+        </w:rPr>
+        <w:t>is_meeting_notes</w:t>
+      </w:r>
+      <w:proofErr w:type="spellEnd"/>
+      <w:proofErr w:type="gramStart"/>
+      <w:r>
+        <w:rPr>
+          <w:rFonts w:ascii="Times New Roman" w:eastAsia="Times New Roman" w:hAnsi="Times New Roman" w:cs="Times New Roman"/>
+          <w:sz w:val="24"/>
+          <w:szCs w:val="24"/>
+        </w:rPr>
+        <w:t>)</w:t>
+      </w:r>
       <w:r>
         <w:rPr>
           <w:rFonts w:ascii="Times New Roman" w:eastAsia="Times New Roman" w:hAnsi="Times New Roman" w:cs="Times New Roman"/>
@@ -949,18 +1186,26 @@
           <w:sz w:val="24"/>
           <w:szCs w:val="24"/>
         </w:rPr>
-        <w:t xml:space="preserve"> calls or emails to remind me of my </w:t>
-      </w:r>
-      <w:proofErr w:type="gramStart"/>
-      <w:r>
-        <w:rPr>
-          <w:rFonts w:ascii="Times New Roman" w:eastAsia="Times New Roman" w:hAnsi="Times New Roman" w:cs="Times New Roman"/>
-          <w:sz w:val="24"/>
-          <w:szCs w:val="24"/>
-        </w:rPr>
-        <w:t>appointments;</w:t>
-      </w:r>
-      <w:proofErr w:type="gramEnd"/>
+        <w:t xml:space="preserve"> time to take notes during my </w:t>
+      </w:r>
+      <w:proofErr w:type="gramStart"/>
+      <w:r>
+        <w:rPr>
+          <w:rFonts w:ascii="Times New Roman" w:eastAsia="Times New Roman" w:hAnsi="Times New Roman" w:cs="Times New Roman"/>
+          <w:sz w:val="24"/>
+          <w:szCs w:val="24"/>
+        </w:rPr>
+        <w:t>meetings;</w:t>
+      </w:r>
+      <w:proofErr w:type="gramEnd"/>
+      <w:r>
+        <w:rPr>
+          <w:rFonts w:ascii="Times New Roman" w:eastAsia="Times New Roman" w:hAnsi="Times New Roman" w:cs="Times New Roman"/>
+          <w:sz w:val="24"/>
+          <w:szCs w:val="24"/>
+        </w:rPr>
+        <w:t xml:space="preserve"> </w:t>
+      </w:r>
     </w:p>
     <w:p>
       <w:pPr>
@@ -987,27 +1232,45 @@
           <w:sz w:val="24"/>
           <w:szCs w:val="24"/>
         </w:rPr>
-        <w:t>is</w:t>
-      </w:r>
-      <w:proofErr w:type="gramEnd"/>
-      <w:r>
-        <w:rPr>
-          <w:rFonts w:ascii="Times New Roman" w:eastAsia="Times New Roman" w:hAnsi="Times New Roman" w:cs="Times New Roman"/>
-          <w:sz w:val="24"/>
-          <w:szCs w:val="24"/>
-        </w:rPr>
-        <w:t>_visual_</w:t>
-      </w:r>
-      <w:proofErr w:type="gramStart"/>
-      <w:r>
-        <w:rPr>
-          <w:rFonts w:ascii="Times New Roman" w:eastAsia="Times New Roman" w:hAnsi="Times New Roman" w:cs="Times New Roman"/>
-          <w:sz w:val="24"/>
-          <w:szCs w:val="24"/>
-        </w:rPr>
-        <w:t>calendar</w:t>
-      </w:r>
-      <w:proofErr w:type="spellEnd"/>
+        <w:t>output</w:t>
+      </w:r>
+      <w:proofErr w:type="gramEnd"/>
+      <w:r>
+        <w:rPr>
+          <w:rFonts w:ascii="Times New Roman" w:eastAsia="Times New Roman" w:hAnsi="Times New Roman" w:cs="Times New Roman"/>
+          <w:sz w:val="24"/>
+          <w:szCs w:val="24"/>
+        </w:rPr>
+        <w:t>_checkbox</w:t>
+      </w:r>
+      <w:proofErr w:type="spellEnd"/>
+      <w:r>
+        <w:rPr>
+          <w:rFonts w:ascii="Times New Roman" w:eastAsia="Times New Roman" w:hAnsi="Times New Roman" w:cs="Times New Roman"/>
+          <w:sz w:val="24"/>
+          <w:szCs w:val="24"/>
+        </w:rPr>
+        <w:t>(</w:t>
+      </w:r>
+      <w:proofErr w:type="spellStart"/>
+      <w:r>
+        <w:rPr>
+          <w:rFonts w:ascii="Times New Roman" w:eastAsia="Times New Roman" w:hAnsi="Times New Roman" w:cs="Times New Roman"/>
+          <w:sz w:val="24"/>
+          <w:szCs w:val="24"/>
+        </w:rPr>
+        <w:t>is_plusone_meetings</w:t>
+      </w:r>
+      <w:proofErr w:type="spellEnd"/>
+      <w:proofErr w:type="gramStart"/>
+      <w:r>
+        <w:rPr>
+          <w:rFonts w:ascii="Times New Roman" w:eastAsia="Times New Roman" w:hAnsi="Times New Roman" w:cs="Times New Roman"/>
+          <w:sz w:val="24"/>
+          <w:szCs w:val="24"/>
+        </w:rPr>
+        <w:t>)</w:t>
+      </w:r>
       <w:r>
         <w:rPr>
           <w:rFonts w:ascii="Times New Roman" w:eastAsia="Times New Roman" w:hAnsi="Times New Roman" w:cs="Times New Roman"/>
@@ -1031,18 +1294,26 @@
           <w:sz w:val="24"/>
           <w:szCs w:val="24"/>
         </w:rPr>
-        <w:t xml:space="preserve"> a visual calendar with my appointments, meetings, and parenting time schedules that I can hang on my </w:t>
-      </w:r>
-      <w:proofErr w:type="gramStart"/>
-      <w:r>
-        <w:rPr>
-          <w:rFonts w:ascii="Times New Roman" w:eastAsia="Times New Roman" w:hAnsi="Times New Roman" w:cs="Times New Roman"/>
-          <w:sz w:val="24"/>
-          <w:szCs w:val="24"/>
-        </w:rPr>
-        <w:t>wall;</w:t>
-      </w:r>
-      <w:proofErr w:type="gramEnd"/>
+        <w:t xml:space="preserve"> allowing me to bring someone to take notes or help during </w:t>
+      </w:r>
+      <w:proofErr w:type="gramStart"/>
+      <w:r>
+        <w:rPr>
+          <w:rFonts w:ascii="Times New Roman" w:eastAsia="Times New Roman" w:hAnsi="Times New Roman" w:cs="Times New Roman"/>
+          <w:sz w:val="24"/>
+          <w:szCs w:val="24"/>
+        </w:rPr>
+        <w:t>meetings;</w:t>
+      </w:r>
+      <w:proofErr w:type="gramEnd"/>
+      <w:r>
+        <w:rPr>
+          <w:rFonts w:ascii="Times New Roman" w:eastAsia="Times New Roman" w:hAnsi="Times New Roman" w:cs="Times New Roman"/>
+          <w:sz w:val="24"/>
+          <w:szCs w:val="24"/>
+        </w:rPr>
+        <w:t xml:space="preserve"> </w:t>
+      </w:r>
     </w:p>
     <w:p>
       <w:pPr>
@@ -1069,27 +1340,45 @@
           <w:sz w:val="24"/>
           <w:szCs w:val="24"/>
         </w:rPr>
-        <w:t>is</w:t>
-      </w:r>
-      <w:proofErr w:type="gramEnd"/>
-      <w:r>
-        <w:rPr>
-          <w:rFonts w:ascii="Times New Roman" w:eastAsia="Times New Roman" w:hAnsi="Times New Roman" w:cs="Times New Roman"/>
-          <w:sz w:val="24"/>
-          <w:szCs w:val="24"/>
-        </w:rPr>
-        <w:t>_meeting_</w:t>
-      </w:r>
-      <w:proofErr w:type="gramStart"/>
-      <w:r>
-        <w:rPr>
-          <w:rFonts w:ascii="Times New Roman" w:eastAsia="Times New Roman" w:hAnsi="Times New Roman" w:cs="Times New Roman"/>
-          <w:sz w:val="24"/>
-          <w:szCs w:val="24"/>
-        </w:rPr>
-        <w:t>notes</w:t>
-      </w:r>
-      <w:proofErr w:type="spellEnd"/>
+        <w:t>output</w:t>
+      </w:r>
+      <w:proofErr w:type="gramEnd"/>
+      <w:r>
+        <w:rPr>
+          <w:rFonts w:ascii="Times New Roman" w:eastAsia="Times New Roman" w:hAnsi="Times New Roman" w:cs="Times New Roman"/>
+          <w:sz w:val="24"/>
+          <w:szCs w:val="24"/>
+        </w:rPr>
+        <w:t>_checkbox</w:t>
+      </w:r>
+      <w:proofErr w:type="spellEnd"/>
+      <w:r>
+        <w:rPr>
+          <w:rFonts w:ascii="Times New Roman" w:eastAsia="Times New Roman" w:hAnsi="Times New Roman" w:cs="Times New Roman"/>
+          <w:sz w:val="24"/>
+          <w:szCs w:val="24"/>
+        </w:rPr>
+        <w:t>(</w:t>
+      </w:r>
+      <w:proofErr w:type="spellStart"/>
+      <w:r>
+        <w:rPr>
+          <w:rFonts w:ascii="Times New Roman" w:eastAsia="Times New Roman" w:hAnsi="Times New Roman" w:cs="Times New Roman"/>
+          <w:sz w:val="24"/>
+          <w:szCs w:val="24"/>
+        </w:rPr>
+        <w:t>is_meeting_materials_preprepared</w:t>
+      </w:r>
+      <w:proofErr w:type="spellEnd"/>
+      <w:proofErr w:type="gramStart"/>
+      <w:r>
+        <w:rPr>
+          <w:rFonts w:ascii="Times New Roman" w:eastAsia="Times New Roman" w:hAnsi="Times New Roman" w:cs="Times New Roman"/>
+          <w:sz w:val="24"/>
+          <w:szCs w:val="24"/>
+        </w:rPr>
+        <w:t>)</w:t>
+      </w:r>
       <w:r>
         <w:rPr>
           <w:rFonts w:ascii="Times New Roman" w:eastAsia="Times New Roman" w:hAnsi="Times New Roman" w:cs="Times New Roman"/>
@@ -1113,26 +1402,18 @@
           <w:sz w:val="24"/>
           <w:szCs w:val="24"/>
         </w:rPr>
-        <w:t xml:space="preserve"> time to take notes during my </w:t>
-      </w:r>
-      <w:proofErr w:type="gramStart"/>
-      <w:r>
-        <w:rPr>
-          <w:rFonts w:ascii="Times New Roman" w:eastAsia="Times New Roman" w:hAnsi="Times New Roman" w:cs="Times New Roman"/>
-          <w:sz w:val="24"/>
-          <w:szCs w:val="24"/>
-        </w:rPr>
-        <w:t>meetings;</w:t>
-      </w:r>
-      <w:proofErr w:type="gramEnd"/>
-      <w:r>
-        <w:rPr>
-          <w:rFonts w:ascii="Times New Roman" w:eastAsia="Times New Roman" w:hAnsi="Times New Roman" w:cs="Times New Roman"/>
-          <w:sz w:val="24"/>
-          <w:szCs w:val="24"/>
-        </w:rPr>
-        <w:t xml:space="preserve"> </w:t>
-      </w:r>
+        <w:t xml:space="preserve"> providing agendas or materials ahead of meetings to allow for preparation and </w:t>
+      </w:r>
+      <w:proofErr w:type="gramStart"/>
+      <w:r>
+        <w:rPr>
+          <w:rFonts w:ascii="Times New Roman" w:eastAsia="Times New Roman" w:hAnsi="Times New Roman" w:cs="Times New Roman"/>
+          <w:sz w:val="24"/>
+          <w:szCs w:val="24"/>
+        </w:rPr>
+        <w:t>review;</w:t>
+      </w:r>
+      <w:proofErr w:type="gramEnd"/>
     </w:p>
     <w:p>
       <w:pPr>
@@ -1159,27 +1440,45 @@
           <w:sz w:val="24"/>
           <w:szCs w:val="24"/>
         </w:rPr>
-        <w:t>is</w:t>
-      </w:r>
-      <w:proofErr w:type="gramEnd"/>
-      <w:r>
-        <w:rPr>
-          <w:rFonts w:ascii="Times New Roman" w:eastAsia="Times New Roman" w:hAnsi="Times New Roman" w:cs="Times New Roman"/>
-          <w:sz w:val="24"/>
-          <w:szCs w:val="24"/>
-        </w:rPr>
-        <w:t>_plusone_</w:t>
-      </w:r>
-      <w:proofErr w:type="gramStart"/>
-      <w:r>
-        <w:rPr>
-          <w:rFonts w:ascii="Times New Roman" w:eastAsia="Times New Roman" w:hAnsi="Times New Roman" w:cs="Times New Roman"/>
-          <w:sz w:val="24"/>
-          <w:szCs w:val="24"/>
-        </w:rPr>
-        <w:t>meetings</w:t>
-      </w:r>
-      <w:proofErr w:type="spellEnd"/>
+        <w:t>output</w:t>
+      </w:r>
+      <w:proofErr w:type="gramEnd"/>
+      <w:r>
+        <w:rPr>
+          <w:rFonts w:ascii="Times New Roman" w:eastAsia="Times New Roman" w:hAnsi="Times New Roman" w:cs="Times New Roman"/>
+          <w:sz w:val="24"/>
+          <w:szCs w:val="24"/>
+        </w:rPr>
+        <w:t>_checkbox</w:t>
+      </w:r>
+      <w:proofErr w:type="spellEnd"/>
+      <w:r>
+        <w:rPr>
+          <w:rFonts w:ascii="Times New Roman" w:eastAsia="Times New Roman" w:hAnsi="Times New Roman" w:cs="Times New Roman"/>
+          <w:sz w:val="24"/>
+          <w:szCs w:val="24"/>
+        </w:rPr>
+        <w:t>(</w:t>
+      </w:r>
+      <w:proofErr w:type="spellStart"/>
+      <w:r>
+        <w:rPr>
+          <w:rFonts w:ascii="Times New Roman" w:eastAsia="Times New Roman" w:hAnsi="Times New Roman" w:cs="Times New Roman"/>
+          <w:sz w:val="24"/>
+          <w:szCs w:val="24"/>
+        </w:rPr>
+        <w:t>is_extra_time</w:t>
+      </w:r>
+      <w:proofErr w:type="spellEnd"/>
+      <w:proofErr w:type="gramStart"/>
+      <w:r>
+        <w:rPr>
+          <w:rFonts w:ascii="Times New Roman" w:eastAsia="Times New Roman" w:hAnsi="Times New Roman" w:cs="Times New Roman"/>
+          <w:sz w:val="24"/>
+          <w:szCs w:val="24"/>
+        </w:rPr>
+        <w:t>)</w:t>
+      </w:r>
       <w:r>
         <w:rPr>
           <w:rFonts w:ascii="Times New Roman" w:eastAsia="Times New Roman" w:hAnsi="Times New Roman" w:cs="Times New Roman"/>
@@ -1203,26 +1502,18 @@
           <w:sz w:val="24"/>
           <w:szCs w:val="24"/>
         </w:rPr>
-        <w:t xml:space="preserve"> allowing me to bring someone to take notes or help during </w:t>
-      </w:r>
-      <w:proofErr w:type="gramStart"/>
-      <w:r>
-        <w:rPr>
-          <w:rFonts w:ascii="Times New Roman" w:eastAsia="Times New Roman" w:hAnsi="Times New Roman" w:cs="Times New Roman"/>
-          <w:sz w:val="24"/>
-          <w:szCs w:val="24"/>
-        </w:rPr>
-        <w:t>meetings;</w:t>
-      </w:r>
-      <w:proofErr w:type="gramEnd"/>
-      <w:r>
-        <w:rPr>
-          <w:rFonts w:ascii="Times New Roman" w:eastAsia="Times New Roman" w:hAnsi="Times New Roman" w:cs="Times New Roman"/>
-          <w:sz w:val="24"/>
-          <w:szCs w:val="24"/>
-        </w:rPr>
-        <w:t xml:space="preserve"> </w:t>
-      </w:r>
+        <w:t xml:space="preserve"> permitting extra time for processing during meetings, including allowing for </w:t>
+      </w:r>
+      <w:proofErr w:type="gramStart"/>
+      <w:r>
+        <w:rPr>
+          <w:rFonts w:ascii="Times New Roman" w:eastAsia="Times New Roman" w:hAnsi="Times New Roman" w:cs="Times New Roman"/>
+          <w:sz w:val="24"/>
+          <w:szCs w:val="24"/>
+        </w:rPr>
+        <w:t>breaks;</w:t>
+      </w:r>
+      <w:proofErr w:type="gramEnd"/>
     </w:p>
     <w:p>
       <w:pPr>
@@ -1249,27 +1540,45 @@
           <w:sz w:val="24"/>
           <w:szCs w:val="24"/>
         </w:rPr>
-        <w:t>is</w:t>
-      </w:r>
-      <w:proofErr w:type="gramEnd"/>
-      <w:r>
-        <w:rPr>
-          <w:rFonts w:ascii="Times New Roman" w:eastAsia="Times New Roman" w:hAnsi="Times New Roman" w:cs="Times New Roman"/>
-          <w:sz w:val="24"/>
-          <w:szCs w:val="24"/>
-        </w:rPr>
-        <w:t>_meeting_materials_</w:t>
-      </w:r>
-      <w:proofErr w:type="gramStart"/>
-      <w:r>
-        <w:rPr>
-          <w:rFonts w:ascii="Times New Roman" w:eastAsia="Times New Roman" w:hAnsi="Times New Roman" w:cs="Times New Roman"/>
-          <w:sz w:val="24"/>
-          <w:szCs w:val="24"/>
-        </w:rPr>
-        <w:t>preprepared</w:t>
-      </w:r>
-      <w:proofErr w:type="spellEnd"/>
+        <w:t>output</w:t>
+      </w:r>
+      <w:proofErr w:type="gramEnd"/>
+      <w:r>
+        <w:rPr>
+          <w:rFonts w:ascii="Times New Roman" w:eastAsia="Times New Roman" w:hAnsi="Times New Roman" w:cs="Times New Roman"/>
+          <w:sz w:val="24"/>
+          <w:szCs w:val="24"/>
+        </w:rPr>
+        <w:t>_checkbox</w:t>
+      </w:r>
+      <w:proofErr w:type="spellEnd"/>
+      <w:r>
+        <w:rPr>
+          <w:rFonts w:ascii="Times New Roman" w:eastAsia="Times New Roman" w:hAnsi="Times New Roman" w:cs="Times New Roman"/>
+          <w:sz w:val="24"/>
+          <w:szCs w:val="24"/>
+        </w:rPr>
+        <w:t>(</w:t>
+      </w:r>
+      <w:proofErr w:type="spellStart"/>
+      <w:r>
+        <w:rPr>
+          <w:rFonts w:ascii="Times New Roman" w:eastAsia="Times New Roman" w:hAnsi="Times New Roman" w:cs="Times New Roman"/>
+          <w:sz w:val="24"/>
+          <w:szCs w:val="24"/>
+        </w:rPr>
+        <w:t>is_translation_plainlanguage</w:t>
+      </w:r>
+      <w:proofErr w:type="spellEnd"/>
+      <w:proofErr w:type="gramStart"/>
+      <w:r>
+        <w:rPr>
+          <w:rFonts w:ascii="Times New Roman" w:eastAsia="Times New Roman" w:hAnsi="Times New Roman" w:cs="Times New Roman"/>
+          <w:sz w:val="24"/>
+          <w:szCs w:val="24"/>
+        </w:rPr>
+        <w:t>)</w:t>
+      </w:r>
       <w:r>
         <w:rPr>
           <w:rFonts w:ascii="Times New Roman" w:eastAsia="Times New Roman" w:hAnsi="Times New Roman" w:cs="Times New Roman"/>
@@ -1293,18 +1602,8 @@
           <w:sz w:val="24"/>
           <w:szCs w:val="24"/>
         </w:rPr>
-        <w:t xml:space="preserve"> providing agendas or materials ahead of meetings to allow for preparation and </w:t>
-      </w:r>
-      <w:proofErr w:type="gramStart"/>
-      <w:r>
-        <w:rPr>
-          <w:rFonts w:ascii="Times New Roman" w:eastAsia="Times New Roman" w:hAnsi="Times New Roman" w:cs="Times New Roman"/>
-          <w:sz w:val="24"/>
-          <w:szCs w:val="24"/>
-        </w:rPr>
-        <w:t>review;</w:t>
-      </w:r>
-      <w:proofErr w:type="gramEnd"/>
+        <w:t xml:space="preserve"> translation of written materials into plain language, </w:t>
+      </w:r>
     </w:p>
     <w:p>
       <w:pPr>
@@ -1331,60 +1630,62 @@
           <w:sz w:val="24"/>
           <w:szCs w:val="24"/>
         </w:rPr>
-        <w:t>is</w:t>
-      </w:r>
-      <w:proofErr w:type="gramEnd"/>
-      <w:r>
-        <w:rPr>
-          <w:rFonts w:ascii="Times New Roman" w:eastAsia="Times New Roman" w:hAnsi="Times New Roman" w:cs="Times New Roman"/>
-          <w:sz w:val="24"/>
-          <w:szCs w:val="24"/>
-        </w:rPr>
-        <w:t>_extra_</w:t>
-      </w:r>
-      <w:proofErr w:type="gramStart"/>
-      <w:r>
-        <w:rPr>
-          <w:rFonts w:ascii="Times New Roman" w:eastAsia="Times New Roman" w:hAnsi="Times New Roman" w:cs="Times New Roman"/>
-          <w:sz w:val="24"/>
-          <w:szCs w:val="24"/>
-        </w:rPr>
-        <w:t>time</w:t>
-      </w:r>
-      <w:proofErr w:type="spellEnd"/>
-      <w:r>
-        <w:rPr>
-          <w:rFonts w:ascii="Times New Roman" w:eastAsia="Times New Roman" w:hAnsi="Times New Roman" w:cs="Times New Roman"/>
-          <w:sz w:val="24"/>
-          <w:szCs w:val="24"/>
-        </w:rPr>
-        <w:t xml:space="preserve"> }</w:t>
-      </w:r>
-      <w:proofErr w:type="gramEnd"/>
-      <w:r>
-        <w:rPr>
-          <w:rFonts w:ascii="Times New Roman" w:eastAsia="Times New Roman" w:hAnsi="Times New Roman" w:cs="Times New Roman"/>
-          <w:sz w:val="24"/>
-          <w:szCs w:val="24"/>
-        </w:rPr>
-        <w:t>}</w:t>
-      </w:r>
-      <w:r>
-        <w:rPr>
-          <w:rFonts w:ascii="Times New Roman" w:eastAsia="Times New Roman" w:hAnsi="Times New Roman" w:cs="Times New Roman"/>
-          <w:sz w:val="24"/>
-          <w:szCs w:val="24"/>
-        </w:rPr>
-        <w:t xml:space="preserve"> permitting extra time for processing during meetings, including allowing for </w:t>
-      </w:r>
-      <w:proofErr w:type="gramStart"/>
-      <w:r>
-        <w:rPr>
-          <w:rFonts w:ascii="Times New Roman" w:eastAsia="Times New Roman" w:hAnsi="Times New Roman" w:cs="Times New Roman"/>
-          <w:sz w:val="24"/>
-          <w:szCs w:val="24"/>
-        </w:rPr>
-        <w:t>breaks;</w:t>
+        <w:t>output</w:t>
+      </w:r>
+      <w:proofErr w:type="gramEnd"/>
+      <w:r>
+        <w:rPr>
+          <w:rFonts w:ascii="Times New Roman" w:eastAsia="Times New Roman" w:hAnsi="Times New Roman" w:cs="Times New Roman"/>
+          <w:sz w:val="24"/>
+          <w:szCs w:val="24"/>
+        </w:rPr>
+        <w:t>_checkbox</w:t>
+      </w:r>
+      <w:proofErr w:type="spellEnd"/>
+      <w:r>
+        <w:rPr>
+          <w:rFonts w:ascii="Times New Roman" w:eastAsia="Times New Roman" w:hAnsi="Times New Roman" w:cs="Times New Roman"/>
+          <w:sz w:val="24"/>
+          <w:szCs w:val="24"/>
+        </w:rPr>
+        <w:t>(</w:t>
+      </w:r>
+      <w:proofErr w:type="spellStart"/>
+      <w:r>
+        <w:rPr>
+          <w:rFonts w:ascii="Times New Roman" w:eastAsia="Times New Roman" w:hAnsi="Times New Roman" w:cs="Times New Roman"/>
+          <w:sz w:val="24"/>
+          <w:szCs w:val="24"/>
+        </w:rPr>
+        <w:t>is_virtual_meetings</w:t>
+      </w:r>
+      <w:proofErr w:type="spellEnd"/>
+      <w:proofErr w:type="gramStart"/>
+      <w:r>
+        <w:rPr>
+          <w:rFonts w:ascii="Times New Roman" w:eastAsia="Times New Roman" w:hAnsi="Times New Roman" w:cs="Times New Roman"/>
+          <w:sz w:val="24"/>
+          <w:szCs w:val="24"/>
+        </w:rPr>
+        <w:t>) }</w:t>
+      </w:r>
+      <w:proofErr w:type="gramEnd"/>
+      <w:r>
+        <w:rPr>
+          <w:rFonts w:ascii="Times New Roman" w:eastAsia="Times New Roman" w:hAnsi="Times New Roman" w:cs="Times New Roman"/>
+          <w:sz w:val="24"/>
+          <w:szCs w:val="24"/>
+        </w:rPr>
+        <w:t xml:space="preserve">} allowing meetings to occur </w:t>
+      </w:r>
+      <w:proofErr w:type="gramStart"/>
+      <w:r>
+        <w:rPr>
+          <w:rFonts w:ascii="Times New Roman" w:eastAsia="Times New Roman" w:hAnsi="Times New Roman" w:cs="Times New Roman"/>
+          <w:sz w:val="24"/>
+          <w:szCs w:val="24"/>
+        </w:rPr>
+        <w:t>virtually;</w:t>
       </w:r>
       <w:proofErr w:type="gramEnd"/>
     </w:p>
@@ -1397,67 +1698,13 @@
           <w:szCs w:val="24"/>
         </w:rPr>
       </w:pPr>
-      <w:proofErr w:type="gramStart"/>
-      <w:r>
-        <w:rPr>
-          <w:rFonts w:ascii="Times New Roman" w:eastAsia="Times New Roman" w:hAnsi="Times New Roman" w:cs="Times New Roman"/>
-          <w:sz w:val="24"/>
-          <w:szCs w:val="24"/>
-        </w:rPr>
-        <w:t xml:space="preserve">{{ </w:t>
-      </w:r>
-      <w:proofErr w:type="spellStart"/>
-      <w:r>
-        <w:rPr>
-          <w:rFonts w:ascii="Times New Roman" w:eastAsia="Times New Roman" w:hAnsi="Times New Roman" w:cs="Times New Roman"/>
-          <w:sz w:val="24"/>
-          <w:szCs w:val="24"/>
-        </w:rPr>
-        <w:t>is</w:t>
-      </w:r>
-      <w:proofErr w:type="gramEnd"/>
-      <w:r>
-        <w:rPr>
-          <w:rFonts w:ascii="Times New Roman" w:eastAsia="Times New Roman" w:hAnsi="Times New Roman" w:cs="Times New Roman"/>
-          <w:sz w:val="24"/>
-          <w:szCs w:val="24"/>
-        </w:rPr>
-        <w:t>_translation_</w:t>
-      </w:r>
-      <w:proofErr w:type="gramStart"/>
-      <w:r>
-        <w:rPr>
-          <w:rFonts w:ascii="Times New Roman" w:eastAsia="Times New Roman" w:hAnsi="Times New Roman" w:cs="Times New Roman"/>
-          <w:sz w:val="24"/>
-          <w:szCs w:val="24"/>
-        </w:rPr>
-        <w:t>plainlanguage</w:t>
-      </w:r>
-      <w:proofErr w:type="spellEnd"/>
-      <w:r>
-        <w:rPr>
-          <w:rFonts w:ascii="Times New Roman" w:eastAsia="Times New Roman" w:hAnsi="Times New Roman" w:cs="Times New Roman"/>
-          <w:sz w:val="24"/>
-          <w:szCs w:val="24"/>
-        </w:rPr>
-        <w:t xml:space="preserve"> }</w:t>
-      </w:r>
-      <w:proofErr w:type="gramEnd"/>
-      <w:r>
-        <w:rPr>
-          <w:rFonts w:ascii="Times New Roman" w:eastAsia="Times New Roman" w:hAnsi="Times New Roman" w:cs="Times New Roman"/>
-          <w:sz w:val="24"/>
-          <w:szCs w:val="24"/>
-        </w:rPr>
-        <w:t>}</w:t>
-      </w:r>
-      <w:r>
-        <w:rPr>
-          <w:rFonts w:ascii="Times New Roman" w:eastAsia="Times New Roman" w:hAnsi="Times New Roman" w:cs="Times New Roman"/>
-          <w:sz w:val="24"/>
-          <w:szCs w:val="24"/>
-        </w:rPr>
-        <w:t xml:space="preserve"> translation of written materials into plain language, </w:t>
+      <w:r>
+        <w:rPr>
+          <w:rFonts w:ascii="Times New Roman" w:eastAsia="Times New Roman" w:hAnsi="Times New Roman" w:cs="Times New Roman"/>
+          <w:sz w:val="24"/>
+          <w:szCs w:val="24"/>
+        </w:rPr>
+        <w:t>______________________________________________________________________________</w:t>
       </w:r>
     </w:p>
     <w:p>
@@ -1469,257 +1716,179 @@
           <w:szCs w:val="24"/>
         </w:rPr>
       </w:pPr>
-      <w:proofErr w:type="gramStart"/>
-      <w:r>
-        <w:rPr>
-          <w:rFonts w:ascii="Times New Roman" w:eastAsia="Times New Roman" w:hAnsi="Times New Roman" w:cs="Times New Roman"/>
-          <w:sz w:val="24"/>
-          <w:szCs w:val="24"/>
-        </w:rPr>
-        <w:t xml:space="preserve">{{ </w:t>
-      </w:r>
-      <w:proofErr w:type="spellStart"/>
-      <w:r>
-        <w:rPr>
-          <w:rFonts w:ascii="Times New Roman" w:eastAsia="Times New Roman" w:hAnsi="Times New Roman" w:cs="Times New Roman"/>
-          <w:sz w:val="24"/>
-          <w:szCs w:val="24"/>
-        </w:rPr>
-        <w:t>is</w:t>
-      </w:r>
-      <w:proofErr w:type="gramEnd"/>
-      <w:r>
-        <w:rPr>
-          <w:rFonts w:ascii="Times New Roman" w:eastAsia="Times New Roman" w:hAnsi="Times New Roman" w:cs="Times New Roman"/>
-          <w:sz w:val="24"/>
-          <w:szCs w:val="24"/>
-        </w:rPr>
-        <w:t>_translation_</w:t>
-      </w:r>
-      <w:proofErr w:type="gramStart"/>
-      <w:r>
-        <w:rPr>
-          <w:rFonts w:ascii="Times New Roman" w:eastAsia="Times New Roman" w:hAnsi="Times New Roman" w:cs="Times New Roman"/>
-          <w:sz w:val="24"/>
-          <w:szCs w:val="24"/>
-        </w:rPr>
-        <w:t>any</w:t>
-      </w:r>
-      <w:proofErr w:type="spellEnd"/>
-      <w:r>
-        <w:rPr>
-          <w:rFonts w:ascii="Times New Roman" w:eastAsia="Times New Roman" w:hAnsi="Times New Roman" w:cs="Times New Roman"/>
-          <w:sz w:val="24"/>
-          <w:szCs w:val="24"/>
-        </w:rPr>
-        <w:t xml:space="preserve"> }}</w:t>
-      </w:r>
-      <w:r>
-        <w:rPr>
-          <w:rFonts w:ascii="Times New Roman" w:eastAsia="Times New Roman" w:hAnsi="Times New Roman" w:cs="Times New Roman"/>
-          <w:sz w:val="24"/>
-          <w:szCs w:val="24"/>
-        </w:rPr>
-        <w:t>interpretation</w:t>
-      </w:r>
-      <w:proofErr w:type="gramEnd"/>
-      <w:r>
-        <w:rPr>
-          <w:rFonts w:ascii="Times New Roman" w:eastAsia="Times New Roman" w:hAnsi="Times New Roman" w:cs="Times New Roman"/>
-          <w:sz w:val="24"/>
-          <w:szCs w:val="24"/>
-        </w:rPr>
-        <w:t xml:space="preserve"> and translation services, such as </w:t>
+      <w:r>
+        <w:rPr>
+          <w:rFonts w:ascii="Times New Roman" w:eastAsia="Times New Roman" w:hAnsi="Times New Roman" w:cs="Times New Roman"/>
+          <w:sz w:val="24"/>
+          <w:szCs w:val="24"/>
+        </w:rPr>
+        <w:t>a change in how I am being taught parenting skills, specifically:</w:t>
       </w:r>
     </w:p>
     <w:p>
       <w:pPr>
         <w:spacing w:after="0" w:line="240" w:lineRule="auto"/>
-        <w:rPr>
-          <w:rFonts w:ascii="Times New Roman" w:eastAsia="Times New Roman" w:hAnsi="Times New Roman" w:cs="Times New Roman"/>
-          <w:sz w:val="24"/>
-          <w:szCs w:val="24"/>
-        </w:rPr>
-      </w:pPr>
-      <w:proofErr w:type="gramStart"/>
-      <w:r>
-        <w:rPr>
-          <w:rFonts w:ascii="Times New Roman" w:eastAsia="Times New Roman" w:hAnsi="Times New Roman" w:cs="Times New Roman"/>
-          <w:sz w:val="24"/>
-          <w:szCs w:val="24"/>
-        </w:rPr>
-        <w:t xml:space="preserve">{{ </w:t>
-      </w:r>
-      <w:proofErr w:type="spellStart"/>
-      <w:r>
-        <w:rPr>
-          <w:rFonts w:ascii="Times New Roman" w:eastAsia="Times New Roman" w:hAnsi="Times New Roman" w:cs="Times New Roman"/>
-          <w:sz w:val="24"/>
-          <w:szCs w:val="24"/>
-        </w:rPr>
-        <w:t>is</w:t>
-      </w:r>
-      <w:proofErr w:type="gramEnd"/>
-      <w:r>
-        <w:rPr>
-          <w:rFonts w:ascii="Times New Roman" w:eastAsia="Times New Roman" w:hAnsi="Times New Roman" w:cs="Times New Roman"/>
-          <w:sz w:val="24"/>
-          <w:szCs w:val="24"/>
-        </w:rPr>
-        <w:t>_vir</w:t>
-      </w:r>
-      <w:r>
-        <w:rPr>
-          <w:rFonts w:ascii="Times New Roman" w:eastAsia="Times New Roman" w:hAnsi="Times New Roman" w:cs="Times New Roman"/>
-          <w:sz w:val="24"/>
-          <w:szCs w:val="24"/>
-        </w:rPr>
-        <w:t>t</w:t>
-      </w:r>
-      <w:r>
-        <w:rPr>
-          <w:rFonts w:ascii="Times New Roman" w:eastAsia="Times New Roman" w:hAnsi="Times New Roman" w:cs="Times New Roman"/>
-          <w:sz w:val="24"/>
-          <w:szCs w:val="24"/>
-        </w:rPr>
-        <w:t>ual_</w:t>
-      </w:r>
-      <w:proofErr w:type="gramStart"/>
-      <w:r>
-        <w:rPr>
-          <w:rFonts w:ascii="Times New Roman" w:eastAsia="Times New Roman" w:hAnsi="Times New Roman" w:cs="Times New Roman"/>
-          <w:sz w:val="24"/>
-          <w:szCs w:val="24"/>
-        </w:rPr>
-        <w:t>meetings</w:t>
-      </w:r>
-      <w:proofErr w:type="spellEnd"/>
-      <w:r>
-        <w:rPr>
-          <w:rFonts w:ascii="Times New Roman" w:eastAsia="Times New Roman" w:hAnsi="Times New Roman" w:cs="Times New Roman"/>
-          <w:sz w:val="24"/>
-          <w:szCs w:val="24"/>
-        </w:rPr>
-        <w:t xml:space="preserve"> }</w:t>
-      </w:r>
-      <w:proofErr w:type="gramEnd"/>
-      <w:r>
-        <w:rPr>
-          <w:rFonts w:ascii="Times New Roman" w:eastAsia="Times New Roman" w:hAnsi="Times New Roman" w:cs="Times New Roman"/>
-          <w:sz w:val="24"/>
-          <w:szCs w:val="24"/>
-        </w:rPr>
-        <w:t>}</w:t>
-      </w:r>
-      <w:r>
-        <w:rPr>
-          <w:rFonts w:ascii="Times New Roman" w:eastAsia="Times New Roman" w:hAnsi="Times New Roman" w:cs="Times New Roman"/>
-          <w:sz w:val="24"/>
-          <w:szCs w:val="24"/>
-        </w:rPr>
-        <w:t xml:space="preserve"> allowing meetings to occur </w:t>
-      </w:r>
-      <w:proofErr w:type="gramStart"/>
-      <w:r>
-        <w:rPr>
-          <w:rFonts w:ascii="Times New Roman" w:eastAsia="Times New Roman" w:hAnsi="Times New Roman" w:cs="Times New Roman"/>
-          <w:sz w:val="24"/>
-          <w:szCs w:val="24"/>
-        </w:rPr>
-        <w:t>virtually;</w:t>
-      </w:r>
-      <w:proofErr w:type="gramEnd"/>
+        <w:ind w:firstLine="720"/>
+        <w:rPr>
+          <w:rFonts w:ascii="Times New Roman" w:eastAsia="Times New Roman" w:hAnsi="Times New Roman" w:cs="Times New Roman"/>
+          <w:sz w:val="24"/>
+          <w:szCs w:val="24"/>
+        </w:rPr>
+      </w:pPr>
+      <w:proofErr w:type="gramStart"/>
+      <w:r>
+        <w:rPr>
+          <w:rFonts w:ascii="Times New Roman" w:eastAsia="Times New Roman" w:hAnsi="Times New Roman" w:cs="Times New Roman"/>
+          <w:sz w:val="24"/>
+          <w:szCs w:val="24"/>
+        </w:rPr>
+        <w:t>{{</w:t>
+      </w:r>
+      <w:r>
+        <w:rPr>
+          <w:rFonts w:ascii="Times New Roman" w:eastAsia="Times New Roman" w:hAnsi="Times New Roman" w:cs="Times New Roman"/>
+          <w:sz w:val="24"/>
+          <w:szCs w:val="24"/>
+        </w:rPr>
+        <w:t xml:space="preserve"> </w:t>
+      </w:r>
+      <w:proofErr w:type="spellStart"/>
+      <w:r>
+        <w:rPr>
+          <w:rFonts w:ascii="Times New Roman" w:eastAsia="Times New Roman" w:hAnsi="Times New Roman" w:cs="Times New Roman"/>
+          <w:sz w:val="24"/>
+          <w:szCs w:val="24"/>
+        </w:rPr>
+        <w:t>output</w:t>
+      </w:r>
+      <w:proofErr w:type="gramEnd"/>
+      <w:r>
+        <w:rPr>
+          <w:rFonts w:ascii="Times New Roman" w:eastAsia="Times New Roman" w:hAnsi="Times New Roman" w:cs="Times New Roman"/>
+          <w:sz w:val="24"/>
+          <w:szCs w:val="24"/>
+        </w:rPr>
+        <w:t>_checkbox</w:t>
+      </w:r>
+      <w:proofErr w:type="spellEnd"/>
+      <w:r>
+        <w:rPr>
+          <w:rFonts w:ascii="Times New Roman" w:eastAsia="Times New Roman" w:hAnsi="Times New Roman" w:cs="Times New Roman"/>
+          <w:sz w:val="24"/>
+          <w:szCs w:val="24"/>
+        </w:rPr>
+        <w:t>(</w:t>
+      </w:r>
+      <w:proofErr w:type="spellStart"/>
+      <w:r>
+        <w:rPr>
+          <w:rFonts w:ascii="Times New Roman" w:eastAsia="Times New Roman" w:hAnsi="Times New Roman" w:cs="Times New Roman"/>
+          <w:sz w:val="24"/>
+          <w:szCs w:val="24"/>
+        </w:rPr>
+        <w:t>skills_shown</w:t>
+      </w:r>
+      <w:proofErr w:type="spellEnd"/>
+      <w:proofErr w:type="gramStart"/>
+      <w:r>
+        <w:rPr>
+          <w:rFonts w:ascii="Times New Roman" w:eastAsia="Times New Roman" w:hAnsi="Times New Roman" w:cs="Times New Roman"/>
+          <w:sz w:val="24"/>
+          <w:szCs w:val="24"/>
+        </w:rPr>
+        <w:t>) }</w:t>
+      </w:r>
+      <w:proofErr w:type="gramEnd"/>
+      <w:r>
+        <w:rPr>
+          <w:rFonts w:ascii="Times New Roman" w:eastAsia="Times New Roman" w:hAnsi="Times New Roman" w:cs="Times New Roman"/>
+          <w:sz w:val="24"/>
+          <w:szCs w:val="24"/>
+        </w:rPr>
+        <w:t xml:space="preserve">} being shown how to use the skills in my home </w:t>
+      </w:r>
     </w:p>
     <w:p>
       <w:pPr>
         <w:spacing w:after="0" w:line="240" w:lineRule="auto"/>
-        <w:rPr>
-          <w:rFonts w:ascii="Times New Roman" w:eastAsia="Times New Roman" w:hAnsi="Times New Roman" w:cs="Times New Roman"/>
-          <w:sz w:val="24"/>
-          <w:szCs w:val="24"/>
-        </w:rPr>
-      </w:pPr>
-      <w:r>
-        <w:rPr>
-          <w:rFonts w:ascii="Times New Roman" w:eastAsia="Times New Roman" w:hAnsi="Times New Roman" w:cs="Times New Roman"/>
-          <w:sz w:val="24"/>
-          <w:szCs w:val="24"/>
-        </w:rPr>
-        <w:t xml:space="preserve">{{ </w:t>
-      </w:r>
-      <w:r>
-        <w:rPr>
-          <w:rFonts w:ascii="Times New Roman" w:eastAsia="Times New Roman" w:hAnsi="Times New Roman" w:cs="Times New Roman"/>
-          <w:sz w:val="24"/>
-          <w:szCs w:val="24"/>
-        </w:rPr>
-        <w:t>is_</w:t>
-      </w:r>
-      <w:r>
-        <w:rPr>
-          <w:rFonts w:ascii="Times New Roman" w:eastAsia="Times New Roman" w:hAnsi="Times New Roman" w:cs="Times New Roman"/>
-          <w:sz w:val="24"/>
-          <w:szCs w:val="24"/>
-        </w:rPr>
-        <w:t>other_fillin</w:t>
-      </w:r>
-      <w:r>
-        <w:rPr>
-          <w:rFonts w:ascii="Times New Roman" w:eastAsia="Times New Roman" w:hAnsi="Times New Roman" w:cs="Times New Roman"/>
-          <w:sz w:val="24"/>
-          <w:szCs w:val="24"/>
-        </w:rPr>
-        <w:t>g</w:t>
-      </w:r>
-      <w:r>
-        <w:rPr>
-          <w:rFonts w:ascii="Times New Roman" w:eastAsia="Times New Roman" w:hAnsi="Times New Roman" w:cs="Times New Roman"/>
-          <w:sz w:val="24"/>
-          <w:szCs w:val="24"/>
-        </w:rPr>
-        <w:t>_1</w:t>
-      </w:r>
-      <w:r>
-        <w:rPr>
-          <w:rFonts w:ascii="Times New Roman" w:eastAsia="Times New Roman" w:hAnsi="Times New Roman" w:cs="Times New Roman"/>
-          <w:sz w:val="24"/>
-          <w:szCs w:val="24"/>
-        </w:rPr>
-        <w:t xml:space="preserve"> }}</w:t>
-      </w:r>
-      <w:r>
-        <w:rPr>
-          <w:rFonts w:ascii="Times New Roman" w:eastAsia="Times New Roman" w:hAnsi="Times New Roman" w:cs="Times New Roman"/>
-          <w:sz w:val="24"/>
-          <w:szCs w:val="24"/>
-        </w:rPr>
-        <w:t xml:space="preserve">other: </w:t>
-      </w:r>
-      <w:r>
-        <w:rPr>
-          <w:rFonts w:ascii="Times New Roman" w:eastAsia="Times New Roman" w:hAnsi="Times New Roman" w:cs="Times New Roman"/>
-          <w:sz w:val="24"/>
-          <w:szCs w:val="24"/>
-        </w:rPr>
-        <w:t xml:space="preserve">{{ </w:t>
-      </w:r>
-      <w:proofErr w:type="spellStart"/>
-      <w:r>
-        <w:rPr>
-          <w:rFonts w:ascii="Times New Roman" w:eastAsia="Times New Roman" w:hAnsi="Times New Roman" w:cs="Times New Roman"/>
-          <w:sz w:val="24"/>
-          <w:szCs w:val="24"/>
-        </w:rPr>
-        <w:t>other_any_one</w:t>
-      </w:r>
-      <w:proofErr w:type="spellEnd"/>
-      <w:r>
-        <w:rPr>
-          <w:rFonts w:ascii="Times New Roman" w:eastAsia="Times New Roman" w:hAnsi="Times New Roman" w:cs="Times New Roman"/>
-          <w:sz w:val="24"/>
-          <w:szCs w:val="24"/>
-        </w:rPr>
-        <w:t xml:space="preserve"> }}.</w:t>
+        <w:ind w:firstLine="720"/>
+        <w:rPr>
+          <w:rFonts w:ascii="Times New Roman" w:eastAsia="Times New Roman" w:hAnsi="Times New Roman" w:cs="Times New Roman"/>
+          <w:sz w:val="24"/>
+          <w:szCs w:val="24"/>
+        </w:rPr>
+      </w:pPr>
+      <w:proofErr w:type="gramStart"/>
+      <w:r>
+        <w:rPr>
+          <w:rFonts w:ascii="Times New Roman" w:eastAsia="Times New Roman" w:hAnsi="Times New Roman" w:cs="Times New Roman"/>
+          <w:sz w:val="24"/>
+          <w:szCs w:val="24"/>
+        </w:rPr>
+        <w:t>{{</w:t>
+      </w:r>
+      <w:r>
+        <w:rPr>
+          <w:rFonts w:ascii="Times New Roman" w:eastAsia="Times New Roman" w:hAnsi="Times New Roman" w:cs="Times New Roman"/>
+          <w:sz w:val="24"/>
+          <w:szCs w:val="24"/>
+        </w:rPr>
+        <w:t xml:space="preserve"> </w:t>
+      </w:r>
+      <w:proofErr w:type="spellStart"/>
+      <w:r>
+        <w:rPr>
+          <w:rFonts w:ascii="Times New Roman" w:eastAsia="Times New Roman" w:hAnsi="Times New Roman" w:cs="Times New Roman"/>
+          <w:sz w:val="24"/>
+          <w:szCs w:val="24"/>
+        </w:rPr>
+        <w:t>output</w:t>
+      </w:r>
+      <w:proofErr w:type="gramEnd"/>
+      <w:r>
+        <w:rPr>
+          <w:rFonts w:ascii="Times New Roman" w:eastAsia="Times New Roman" w:hAnsi="Times New Roman" w:cs="Times New Roman"/>
+          <w:sz w:val="24"/>
+          <w:szCs w:val="24"/>
+        </w:rPr>
+        <w:t>_checkbox</w:t>
+      </w:r>
+      <w:proofErr w:type="spellEnd"/>
+      <w:r>
+        <w:rPr>
+          <w:rFonts w:ascii="Times New Roman" w:eastAsia="Times New Roman" w:hAnsi="Times New Roman" w:cs="Times New Roman"/>
+          <w:sz w:val="24"/>
+          <w:szCs w:val="24"/>
+        </w:rPr>
+        <w:t>(</w:t>
+      </w:r>
+      <w:proofErr w:type="spellStart"/>
+      <w:r>
+        <w:rPr>
+          <w:rFonts w:ascii="Times New Roman" w:eastAsia="Times New Roman" w:hAnsi="Times New Roman" w:cs="Times New Roman"/>
+          <w:sz w:val="24"/>
+          <w:szCs w:val="24"/>
+        </w:rPr>
+        <w:t>skills_pictures</w:t>
+      </w:r>
+      <w:proofErr w:type="spellEnd"/>
+      <w:proofErr w:type="gramStart"/>
+      <w:r>
+        <w:rPr>
+          <w:rFonts w:ascii="Times New Roman" w:eastAsia="Times New Roman" w:hAnsi="Times New Roman" w:cs="Times New Roman"/>
+          <w:sz w:val="24"/>
+          <w:szCs w:val="24"/>
+        </w:rPr>
+        <w:t>) }</w:t>
+      </w:r>
+      <w:proofErr w:type="gramEnd"/>
+      <w:r>
+        <w:rPr>
+          <w:rFonts w:ascii="Times New Roman" w:eastAsia="Times New Roman" w:hAnsi="Times New Roman" w:cs="Times New Roman"/>
+          <w:sz w:val="24"/>
+          <w:szCs w:val="24"/>
+        </w:rPr>
+        <w:t>} using pictures rather than words for step-by-step instructions</w:t>
       </w:r>
     </w:p>
     <w:p>
@@ -1731,180 +1900,52 @@
           <w:szCs w:val="24"/>
         </w:rPr>
       </w:pPr>
-      <w:proofErr w:type="gramStart"/>
-      <w:r>
-        <w:rPr>
-          <w:rFonts w:ascii="Times New Roman" w:eastAsia="Times New Roman" w:hAnsi="Times New Roman" w:cs="Times New Roman"/>
-          <w:sz w:val="24"/>
-          <w:szCs w:val="24"/>
-        </w:rPr>
-        <w:t xml:space="preserve">{{ </w:t>
-      </w:r>
-      <w:r>
-        <w:rPr>
-          <w:rFonts w:ascii="Times New Roman" w:eastAsia="Times New Roman" w:hAnsi="Times New Roman" w:cs="Times New Roman"/>
-          <w:sz w:val="24"/>
-          <w:szCs w:val="24"/>
-        </w:rPr>
-        <w:t>is</w:t>
-      </w:r>
-      <w:proofErr w:type="gramEnd"/>
-      <w:r>
-        <w:rPr>
-          <w:rFonts w:ascii="Times New Roman" w:eastAsia="Times New Roman" w:hAnsi="Times New Roman" w:cs="Times New Roman"/>
-          <w:sz w:val="24"/>
-          <w:szCs w:val="24"/>
-        </w:rPr>
-        <w:t>_other_fillin</w:t>
-      </w:r>
-      <w:r>
-        <w:rPr>
-          <w:rFonts w:ascii="Times New Roman" w:eastAsia="Times New Roman" w:hAnsi="Times New Roman" w:cs="Times New Roman"/>
-          <w:sz w:val="24"/>
-          <w:szCs w:val="24"/>
-        </w:rPr>
-        <w:t>g</w:t>
-      </w:r>
-      <w:r>
-        <w:rPr>
-          <w:rFonts w:ascii="Times New Roman" w:eastAsia="Times New Roman" w:hAnsi="Times New Roman" w:cs="Times New Roman"/>
-          <w:sz w:val="24"/>
-          <w:szCs w:val="24"/>
-        </w:rPr>
-        <w:t>_</w:t>
-      </w:r>
-      <w:proofErr w:type="gramStart"/>
-      <w:r>
-        <w:rPr>
-          <w:rFonts w:ascii="Times New Roman" w:eastAsia="Times New Roman" w:hAnsi="Times New Roman" w:cs="Times New Roman"/>
-          <w:sz w:val="24"/>
-          <w:szCs w:val="24"/>
-        </w:rPr>
-        <w:t>2</w:t>
-      </w:r>
-      <w:r>
-        <w:rPr>
-          <w:rFonts w:ascii="Times New Roman" w:eastAsia="Times New Roman" w:hAnsi="Times New Roman" w:cs="Times New Roman"/>
-          <w:sz w:val="24"/>
-          <w:szCs w:val="24"/>
-        </w:rPr>
-        <w:t xml:space="preserve"> }}</w:t>
-      </w:r>
-      <w:r>
-        <w:rPr>
-          <w:rFonts w:ascii="Times New Roman" w:eastAsia="Times New Roman" w:hAnsi="Times New Roman" w:cs="Times New Roman"/>
-          <w:sz w:val="24"/>
-          <w:szCs w:val="24"/>
-        </w:rPr>
-        <w:t>other</w:t>
-      </w:r>
-      <w:proofErr w:type="gramEnd"/>
-      <w:r>
-        <w:rPr>
-          <w:rFonts w:ascii="Times New Roman" w:eastAsia="Times New Roman" w:hAnsi="Times New Roman" w:cs="Times New Roman"/>
-          <w:sz w:val="24"/>
-          <w:szCs w:val="24"/>
-        </w:rPr>
-        <w:t xml:space="preserve">: </w:t>
-      </w:r>
-      <w:proofErr w:type="gramStart"/>
-      <w:r>
-        <w:rPr>
-          <w:rFonts w:ascii="Times New Roman" w:eastAsia="Times New Roman" w:hAnsi="Times New Roman" w:cs="Times New Roman"/>
-          <w:sz w:val="24"/>
-          <w:szCs w:val="24"/>
-        </w:rPr>
-        <w:t xml:space="preserve">{{ </w:t>
-      </w:r>
-      <w:proofErr w:type="spellStart"/>
-      <w:r>
-        <w:rPr>
-          <w:rFonts w:ascii="Times New Roman" w:eastAsia="Times New Roman" w:hAnsi="Times New Roman" w:cs="Times New Roman"/>
-          <w:sz w:val="24"/>
-          <w:szCs w:val="24"/>
-        </w:rPr>
-        <w:t>other</w:t>
-      </w:r>
-      <w:proofErr w:type="gramEnd"/>
-      <w:r>
-        <w:rPr>
-          <w:rFonts w:ascii="Times New Roman" w:eastAsia="Times New Roman" w:hAnsi="Times New Roman" w:cs="Times New Roman"/>
-          <w:sz w:val="24"/>
-          <w:szCs w:val="24"/>
-        </w:rPr>
-        <w:t>_any_</w:t>
-      </w:r>
-      <w:proofErr w:type="gramStart"/>
-      <w:r>
-        <w:rPr>
-          <w:rFonts w:ascii="Times New Roman" w:eastAsia="Times New Roman" w:hAnsi="Times New Roman" w:cs="Times New Roman"/>
-          <w:sz w:val="24"/>
-          <w:szCs w:val="24"/>
-        </w:rPr>
-        <w:t>two</w:t>
-      </w:r>
-      <w:proofErr w:type="spellEnd"/>
-      <w:r>
-        <w:rPr>
-          <w:rFonts w:ascii="Times New Roman" w:eastAsia="Times New Roman" w:hAnsi="Times New Roman" w:cs="Times New Roman"/>
-          <w:sz w:val="24"/>
-          <w:szCs w:val="24"/>
-        </w:rPr>
-        <w:t xml:space="preserve"> }}</w:t>
-      </w:r>
-      <w:r>
-        <w:rPr>
-          <w:rFonts w:ascii="Times New Roman" w:eastAsia="Times New Roman" w:hAnsi="Times New Roman" w:cs="Times New Roman"/>
-          <w:sz w:val="24"/>
-          <w:szCs w:val="24"/>
-        </w:rPr>
-        <w:t>;</w:t>
-      </w:r>
-      <w:proofErr w:type="gramEnd"/>
+      <w:r>
+        <w:rPr>
+          <w:rFonts w:ascii="Times New Roman" w:eastAsia="Times New Roman" w:hAnsi="Times New Roman" w:cs="Times New Roman"/>
+          <w:sz w:val="24"/>
+          <w:szCs w:val="24"/>
+        </w:rPr>
+        <w:t>adaptive parenting equipment, such as</w:t>
+      </w:r>
     </w:p>
     <w:p>
       <w:pPr>
         <w:spacing w:after="0" w:line="240" w:lineRule="auto"/>
-        <w:rPr>
-          <w:rFonts w:ascii="Times New Roman" w:eastAsia="Times New Roman" w:hAnsi="Times New Roman" w:cs="Times New Roman"/>
-          <w:sz w:val="24"/>
-          <w:szCs w:val="24"/>
-        </w:rPr>
-      </w:pPr>
-      <w:proofErr w:type="gramStart"/>
-      <w:r>
-        <w:rPr>
-          <w:rFonts w:ascii="Times New Roman" w:eastAsia="Times New Roman" w:hAnsi="Times New Roman" w:cs="Times New Roman"/>
-          <w:sz w:val="24"/>
-          <w:szCs w:val="24"/>
-        </w:rPr>
-        <w:t xml:space="preserve">{{ </w:t>
-      </w:r>
-      <w:r>
-        <w:rPr>
-          <w:rFonts w:ascii="Times New Roman" w:eastAsia="Times New Roman" w:hAnsi="Times New Roman" w:cs="Times New Roman"/>
-          <w:sz w:val="24"/>
-          <w:szCs w:val="24"/>
-        </w:rPr>
-        <w:t>is</w:t>
-      </w:r>
-      <w:proofErr w:type="gramEnd"/>
-      <w:r>
-        <w:rPr>
-          <w:rFonts w:ascii="Times New Roman" w:eastAsia="Times New Roman" w:hAnsi="Times New Roman" w:cs="Times New Roman"/>
-          <w:sz w:val="24"/>
-          <w:szCs w:val="24"/>
-        </w:rPr>
-        <w:t>_other_fillin</w:t>
-      </w:r>
-      <w:r>
-        <w:rPr>
-          <w:rFonts w:ascii="Times New Roman" w:eastAsia="Times New Roman" w:hAnsi="Times New Roman" w:cs="Times New Roman"/>
-          <w:sz w:val="24"/>
-          <w:szCs w:val="24"/>
-        </w:rPr>
-        <w:t>g</w:t>
-      </w:r>
+        <w:ind w:firstLine="720"/>
+        <w:rPr>
+          <w:rFonts w:ascii="Times New Roman" w:eastAsia="Times New Roman" w:hAnsi="Times New Roman" w:cs="Times New Roman"/>
+          <w:sz w:val="24"/>
+          <w:szCs w:val="24"/>
+        </w:rPr>
+      </w:pPr>
+      <w:proofErr w:type="gramStart"/>
+      <w:r>
+        <w:rPr>
+          <w:rFonts w:ascii="Times New Roman" w:eastAsia="Times New Roman" w:hAnsi="Times New Roman" w:cs="Times New Roman"/>
+          <w:sz w:val="24"/>
+          <w:szCs w:val="24"/>
+        </w:rPr>
+        <w:t>{{</w:t>
+      </w:r>
+      <w:r>
+        <w:rPr>
+          <w:rFonts w:ascii="Times New Roman" w:eastAsia="Times New Roman" w:hAnsi="Times New Roman" w:cs="Times New Roman"/>
+          <w:sz w:val="24"/>
+          <w:szCs w:val="24"/>
+        </w:rPr>
+        <w:t xml:space="preserve"> </w:t>
+      </w:r>
+      <w:proofErr w:type="spellStart"/>
+      <w:r>
+        <w:rPr>
+          <w:rFonts w:ascii="Times New Roman" w:eastAsia="Times New Roman" w:hAnsi="Times New Roman" w:cs="Times New Roman"/>
+          <w:sz w:val="24"/>
+          <w:szCs w:val="24"/>
+        </w:rPr>
+        <w:t>output</w:t>
+      </w:r>
+      <w:proofErr w:type="gramEnd"/>
       <w:r>
         <w:rPr>
           <w:rFonts w:ascii="Times New Roman" w:eastAsia="Times New Roman" w:hAnsi="Times New Roman" w:cs="Times New Roman"/>
@@ -1920,105 +1961,1157 @@
           <w:sz w:val="24"/>
           <w:szCs w:val="24"/>
         </w:rPr>
-        <w:t>3</w:t>
-      </w:r>
-      <w:r>
-        <w:rPr>
-          <w:rFonts w:ascii="Times New Roman" w:eastAsia="Times New Roman" w:hAnsi="Times New Roman" w:cs="Times New Roman"/>
-          <w:sz w:val="24"/>
-          <w:szCs w:val="24"/>
-        </w:rPr>
-        <w:t xml:space="preserve"> }}</w:t>
-      </w:r>
-      <w:r>
-        <w:rPr>
-          <w:rFonts w:ascii="Times New Roman" w:eastAsia="Times New Roman" w:hAnsi="Times New Roman" w:cs="Times New Roman"/>
-          <w:sz w:val="24"/>
-          <w:szCs w:val="24"/>
-        </w:rPr>
-        <w:t>other</w:t>
-      </w:r>
-      <w:proofErr w:type="gramEnd"/>
-      <w:r>
-        <w:rPr>
-          <w:rFonts w:ascii="Times New Roman" w:eastAsia="Times New Roman" w:hAnsi="Times New Roman" w:cs="Times New Roman"/>
-          <w:sz w:val="24"/>
-          <w:szCs w:val="24"/>
-        </w:rPr>
-        <w:t xml:space="preserve">: </w:t>
-      </w:r>
-      <w:proofErr w:type="gramStart"/>
-      <w:r>
-        <w:rPr>
-          <w:rFonts w:ascii="Times New Roman" w:eastAsia="Times New Roman" w:hAnsi="Times New Roman" w:cs="Times New Roman"/>
-          <w:sz w:val="24"/>
-          <w:szCs w:val="24"/>
-        </w:rPr>
-        <w:t xml:space="preserve">{{ </w:t>
-      </w:r>
-      <w:proofErr w:type="spellStart"/>
-      <w:r>
-        <w:rPr>
-          <w:rFonts w:ascii="Times New Roman" w:eastAsia="Times New Roman" w:hAnsi="Times New Roman" w:cs="Times New Roman"/>
-          <w:sz w:val="24"/>
-          <w:szCs w:val="24"/>
-        </w:rPr>
-        <w:t>other</w:t>
-      </w:r>
-      <w:proofErr w:type="gramEnd"/>
-      <w:r>
-        <w:rPr>
-          <w:rFonts w:ascii="Times New Roman" w:eastAsia="Times New Roman" w:hAnsi="Times New Roman" w:cs="Times New Roman"/>
-          <w:sz w:val="24"/>
-          <w:szCs w:val="24"/>
-        </w:rPr>
-        <w:t>_any_</w:t>
-      </w:r>
-      <w:proofErr w:type="gramStart"/>
-      <w:r>
-        <w:rPr>
-          <w:rFonts w:ascii="Times New Roman" w:eastAsia="Times New Roman" w:hAnsi="Times New Roman" w:cs="Times New Roman"/>
-          <w:sz w:val="24"/>
-          <w:szCs w:val="24"/>
-        </w:rPr>
-        <w:t>three</w:t>
-      </w:r>
-      <w:proofErr w:type="spellEnd"/>
-      <w:r>
-        <w:rPr>
-          <w:rFonts w:ascii="Times New Roman" w:eastAsia="Times New Roman" w:hAnsi="Times New Roman" w:cs="Times New Roman"/>
-          <w:sz w:val="24"/>
-          <w:szCs w:val="24"/>
-        </w:rPr>
-        <w:t xml:space="preserve"> }</w:t>
-      </w:r>
-      <w:proofErr w:type="gramEnd"/>
-      <w:r>
-        <w:rPr>
-          <w:rFonts w:ascii="Times New Roman" w:eastAsia="Times New Roman" w:hAnsi="Times New Roman" w:cs="Times New Roman"/>
-          <w:sz w:val="24"/>
-          <w:szCs w:val="24"/>
-        </w:rPr>
-        <w:t>}</w:t>
-      </w:r>
-      <w:r>
-        <w:rPr>
-          <w:rFonts w:ascii="Times New Roman" w:eastAsia="Times New Roman" w:hAnsi="Times New Roman" w:cs="Times New Roman"/>
-          <w:sz w:val="24"/>
-          <w:szCs w:val="24"/>
-        </w:rPr>
-        <w:t>.</w:t>
+        <w:t>checkbox</w:t>
+      </w:r>
+      <w:proofErr w:type="spellEnd"/>
+      <w:r>
+        <w:rPr>
+          <w:rFonts w:ascii="Times New Roman" w:eastAsia="Times New Roman" w:hAnsi="Times New Roman" w:cs="Times New Roman"/>
+          <w:sz w:val="24"/>
+          <w:szCs w:val="24"/>
+        </w:rPr>
+        <w:t>(</w:t>
+      </w:r>
+      <w:r>
+        <w:rPr>
+          <w:rFonts w:ascii="Times New Roman" w:eastAsia="Times New Roman" w:hAnsi="Times New Roman" w:cs="Times New Roman"/>
+          <w:sz w:val="24"/>
+          <w:szCs w:val="24"/>
+        </w:rPr>
+        <w:t xml:space="preserve"> </w:t>
+      </w:r>
+      <w:proofErr w:type="spellStart"/>
+      <w:r>
+        <w:rPr>
+          <w:rFonts w:ascii="Times New Roman" w:eastAsia="Times New Roman" w:hAnsi="Times New Roman" w:cs="Times New Roman"/>
+          <w:sz w:val="24"/>
+          <w:szCs w:val="24"/>
+        </w:rPr>
+        <w:t>adpt</w:t>
+      </w:r>
+      <w:proofErr w:type="gramEnd"/>
+      <w:r>
+        <w:rPr>
+          <w:rFonts w:ascii="Times New Roman" w:eastAsia="Times New Roman" w:hAnsi="Times New Roman" w:cs="Times New Roman"/>
+          <w:sz w:val="24"/>
+          <w:szCs w:val="24"/>
+        </w:rPr>
+        <w:t>_braille</w:t>
+      </w:r>
+      <w:proofErr w:type="spellEnd"/>
+      <w:proofErr w:type="gramStart"/>
+      <w:r>
+        <w:rPr>
+          <w:rFonts w:ascii="Times New Roman" w:eastAsia="Times New Roman" w:hAnsi="Times New Roman" w:cs="Times New Roman"/>
+          <w:sz w:val="24"/>
+          <w:szCs w:val="24"/>
+        </w:rPr>
+        <w:t>) }</w:t>
+      </w:r>
+      <w:proofErr w:type="gramEnd"/>
+      <w:r>
+        <w:rPr>
+          <w:rFonts w:ascii="Times New Roman" w:eastAsia="Times New Roman" w:hAnsi="Times New Roman" w:cs="Times New Roman"/>
+          <w:sz w:val="24"/>
+          <w:szCs w:val="24"/>
+        </w:rPr>
+        <w:t>} Braille books</w:t>
       </w:r>
     </w:p>
     <w:p>
       <w:pPr>
         <w:spacing w:after="0" w:line="240" w:lineRule="auto"/>
-        <w:rPr>
-          <w:rFonts w:ascii="Times New Roman" w:eastAsia="Times New Roman" w:hAnsi="Times New Roman" w:cs="Times New Roman"/>
-          <w:sz w:val="24"/>
-          <w:szCs w:val="24"/>
-        </w:rPr>
-      </w:pPr>
+        <w:ind w:firstLine="720"/>
+        <w:rPr>
+          <w:rFonts w:ascii="Times New Roman" w:eastAsia="Times New Roman" w:hAnsi="Times New Roman" w:cs="Times New Roman"/>
+          <w:sz w:val="24"/>
+          <w:szCs w:val="24"/>
+        </w:rPr>
+      </w:pPr>
+      <w:proofErr w:type="gramStart"/>
+      <w:r>
+        <w:rPr>
+          <w:rFonts w:ascii="Times New Roman" w:eastAsia="Times New Roman" w:hAnsi="Times New Roman" w:cs="Times New Roman"/>
+          <w:sz w:val="24"/>
+          <w:szCs w:val="24"/>
+        </w:rPr>
+        <w:t>{{</w:t>
+      </w:r>
+      <w:r>
+        <w:rPr>
+          <w:rFonts w:ascii="Times New Roman" w:eastAsia="Times New Roman" w:hAnsi="Times New Roman" w:cs="Times New Roman"/>
+          <w:sz w:val="24"/>
+          <w:szCs w:val="24"/>
+        </w:rPr>
+        <w:t xml:space="preserve"> </w:t>
+      </w:r>
+      <w:proofErr w:type="spellStart"/>
+      <w:r>
+        <w:rPr>
+          <w:rFonts w:ascii="Times New Roman" w:eastAsia="Times New Roman" w:hAnsi="Times New Roman" w:cs="Times New Roman"/>
+          <w:sz w:val="24"/>
+          <w:szCs w:val="24"/>
+        </w:rPr>
+        <w:t>output</w:t>
+      </w:r>
+      <w:proofErr w:type="gramEnd"/>
+      <w:r>
+        <w:rPr>
+          <w:rFonts w:ascii="Times New Roman" w:eastAsia="Times New Roman" w:hAnsi="Times New Roman" w:cs="Times New Roman"/>
+          <w:sz w:val="24"/>
+          <w:szCs w:val="24"/>
+        </w:rPr>
+        <w:t>_</w:t>
+      </w:r>
+      <w:proofErr w:type="gramStart"/>
+      <w:r>
+        <w:rPr>
+          <w:rFonts w:ascii="Times New Roman" w:eastAsia="Times New Roman" w:hAnsi="Times New Roman" w:cs="Times New Roman"/>
+          <w:sz w:val="24"/>
+          <w:szCs w:val="24"/>
+        </w:rPr>
+        <w:t>checkbox</w:t>
+      </w:r>
+      <w:proofErr w:type="spellEnd"/>
+      <w:r>
+        <w:rPr>
+          <w:rFonts w:ascii="Times New Roman" w:eastAsia="Times New Roman" w:hAnsi="Times New Roman" w:cs="Times New Roman"/>
+          <w:sz w:val="24"/>
+          <w:szCs w:val="24"/>
+        </w:rPr>
+        <w:t>(</w:t>
+      </w:r>
+      <w:r>
+        <w:rPr>
+          <w:rFonts w:ascii="Times New Roman" w:eastAsia="Times New Roman" w:hAnsi="Times New Roman" w:cs="Times New Roman"/>
+          <w:sz w:val="24"/>
+          <w:szCs w:val="24"/>
+        </w:rPr>
+        <w:t xml:space="preserve"> </w:t>
+      </w:r>
+      <w:proofErr w:type="spellStart"/>
+      <w:r>
+        <w:rPr>
+          <w:rFonts w:ascii="Times New Roman" w:eastAsia="Times New Roman" w:hAnsi="Times New Roman" w:cs="Times New Roman"/>
+          <w:sz w:val="24"/>
+          <w:szCs w:val="24"/>
+        </w:rPr>
+        <w:t>adpt</w:t>
+      </w:r>
+      <w:proofErr w:type="gramEnd"/>
+      <w:r>
+        <w:rPr>
+          <w:rFonts w:ascii="Times New Roman" w:eastAsia="Times New Roman" w:hAnsi="Times New Roman" w:cs="Times New Roman"/>
+          <w:sz w:val="24"/>
+          <w:szCs w:val="24"/>
+        </w:rPr>
+        <w:t>_therm</w:t>
+      </w:r>
+      <w:proofErr w:type="spellEnd"/>
+      <w:proofErr w:type="gramStart"/>
+      <w:r>
+        <w:rPr>
+          <w:rFonts w:ascii="Times New Roman" w:eastAsia="Times New Roman" w:hAnsi="Times New Roman" w:cs="Times New Roman"/>
+          <w:sz w:val="24"/>
+          <w:szCs w:val="24"/>
+        </w:rPr>
+        <w:t>) }</w:t>
+      </w:r>
+      <w:proofErr w:type="gramEnd"/>
+      <w:r>
+        <w:rPr>
+          <w:rFonts w:ascii="Times New Roman" w:eastAsia="Times New Roman" w:hAnsi="Times New Roman" w:cs="Times New Roman"/>
+          <w:sz w:val="24"/>
+          <w:szCs w:val="24"/>
+        </w:rPr>
+        <w:t>} talking thermometers</w:t>
+      </w:r>
+    </w:p>
+    <w:p>
+      <w:pPr>
+        <w:spacing w:after="0" w:line="240" w:lineRule="auto"/>
+        <w:ind w:firstLine="720"/>
+        <w:rPr>
+          <w:rFonts w:ascii="Times New Roman" w:eastAsia="Times New Roman" w:hAnsi="Times New Roman" w:cs="Times New Roman"/>
+          <w:sz w:val="24"/>
+          <w:szCs w:val="24"/>
+        </w:rPr>
+      </w:pPr>
+      <w:proofErr w:type="gramStart"/>
+      <w:r>
+        <w:rPr>
+          <w:rFonts w:ascii="Times New Roman" w:eastAsia="Times New Roman" w:hAnsi="Times New Roman" w:cs="Times New Roman"/>
+          <w:sz w:val="24"/>
+          <w:szCs w:val="24"/>
+        </w:rPr>
+        <w:t>{{</w:t>
+      </w:r>
+      <w:r>
+        <w:rPr>
+          <w:rFonts w:ascii="Times New Roman" w:eastAsia="Times New Roman" w:hAnsi="Times New Roman" w:cs="Times New Roman"/>
+          <w:sz w:val="24"/>
+          <w:szCs w:val="24"/>
+        </w:rPr>
+        <w:t xml:space="preserve"> </w:t>
+      </w:r>
+      <w:proofErr w:type="spellStart"/>
+      <w:r>
+        <w:rPr>
+          <w:rFonts w:ascii="Times New Roman" w:eastAsia="Times New Roman" w:hAnsi="Times New Roman" w:cs="Times New Roman"/>
+          <w:sz w:val="24"/>
+          <w:szCs w:val="24"/>
+        </w:rPr>
+        <w:t>output</w:t>
+      </w:r>
+      <w:proofErr w:type="gramEnd"/>
+      <w:r>
+        <w:rPr>
+          <w:rFonts w:ascii="Times New Roman" w:eastAsia="Times New Roman" w:hAnsi="Times New Roman" w:cs="Times New Roman"/>
+          <w:sz w:val="24"/>
+          <w:szCs w:val="24"/>
+        </w:rPr>
+        <w:t>_</w:t>
+      </w:r>
+      <w:proofErr w:type="gramStart"/>
+      <w:r>
+        <w:rPr>
+          <w:rFonts w:ascii="Times New Roman" w:eastAsia="Times New Roman" w:hAnsi="Times New Roman" w:cs="Times New Roman"/>
+          <w:sz w:val="24"/>
+          <w:szCs w:val="24"/>
+        </w:rPr>
+        <w:t>checkbox</w:t>
+      </w:r>
+      <w:proofErr w:type="spellEnd"/>
+      <w:r>
+        <w:rPr>
+          <w:rFonts w:ascii="Times New Roman" w:eastAsia="Times New Roman" w:hAnsi="Times New Roman" w:cs="Times New Roman"/>
+          <w:sz w:val="24"/>
+          <w:szCs w:val="24"/>
+        </w:rPr>
+        <w:t>(</w:t>
+      </w:r>
+      <w:r>
+        <w:rPr>
+          <w:rFonts w:ascii="Times New Roman" w:eastAsia="Times New Roman" w:hAnsi="Times New Roman" w:cs="Times New Roman"/>
+          <w:sz w:val="24"/>
+          <w:szCs w:val="24"/>
+        </w:rPr>
+        <w:t xml:space="preserve"> </w:t>
+      </w:r>
+      <w:proofErr w:type="spellStart"/>
+      <w:r>
+        <w:rPr>
+          <w:rFonts w:ascii="Times New Roman" w:eastAsia="Times New Roman" w:hAnsi="Times New Roman" w:cs="Times New Roman"/>
+          <w:sz w:val="24"/>
+          <w:szCs w:val="24"/>
+        </w:rPr>
+        <w:t>adpt</w:t>
+      </w:r>
+      <w:proofErr w:type="gramEnd"/>
+      <w:r>
+        <w:rPr>
+          <w:rFonts w:ascii="Times New Roman" w:eastAsia="Times New Roman" w:hAnsi="Times New Roman" w:cs="Times New Roman"/>
+          <w:sz w:val="24"/>
+          <w:szCs w:val="24"/>
+        </w:rPr>
+        <w:t>_med_disp</w:t>
+      </w:r>
+      <w:proofErr w:type="spellEnd"/>
+      <w:proofErr w:type="gramStart"/>
+      <w:r>
+        <w:rPr>
+          <w:rFonts w:ascii="Times New Roman" w:eastAsia="Times New Roman" w:hAnsi="Times New Roman" w:cs="Times New Roman"/>
+          <w:sz w:val="24"/>
+          <w:szCs w:val="24"/>
+        </w:rPr>
+        <w:t>) }</w:t>
+      </w:r>
+      <w:proofErr w:type="gramEnd"/>
+      <w:r>
+        <w:rPr>
+          <w:rFonts w:ascii="Times New Roman" w:eastAsia="Times New Roman" w:hAnsi="Times New Roman" w:cs="Times New Roman"/>
+          <w:sz w:val="24"/>
+          <w:szCs w:val="24"/>
+        </w:rPr>
+        <w:t>} tactile medicine dispensers</w:t>
+      </w:r>
+    </w:p>
+    <w:p>
+      <w:pPr>
+        <w:spacing w:after="0" w:line="240" w:lineRule="auto"/>
+        <w:ind w:firstLine="720"/>
+        <w:rPr>
+          <w:rFonts w:ascii="Times New Roman" w:eastAsia="Times New Roman" w:hAnsi="Times New Roman" w:cs="Times New Roman"/>
+          <w:sz w:val="24"/>
+          <w:szCs w:val="24"/>
+        </w:rPr>
+      </w:pPr>
+      <w:proofErr w:type="gramStart"/>
+      <w:r>
+        <w:rPr>
+          <w:rFonts w:ascii="Times New Roman" w:eastAsia="Times New Roman" w:hAnsi="Times New Roman" w:cs="Times New Roman"/>
+          <w:sz w:val="24"/>
+          <w:szCs w:val="24"/>
+        </w:rPr>
+        <w:t>{{</w:t>
+      </w:r>
+      <w:r>
+        <w:rPr>
+          <w:rFonts w:ascii="Times New Roman" w:eastAsia="Times New Roman" w:hAnsi="Times New Roman" w:cs="Times New Roman"/>
+          <w:sz w:val="24"/>
+          <w:szCs w:val="24"/>
+        </w:rPr>
+        <w:t xml:space="preserve"> </w:t>
+      </w:r>
+      <w:proofErr w:type="spellStart"/>
+      <w:r>
+        <w:rPr>
+          <w:rFonts w:ascii="Times New Roman" w:eastAsia="Times New Roman" w:hAnsi="Times New Roman" w:cs="Times New Roman"/>
+          <w:sz w:val="24"/>
+          <w:szCs w:val="24"/>
+        </w:rPr>
+        <w:t>output</w:t>
+      </w:r>
+      <w:proofErr w:type="gramEnd"/>
+      <w:r>
+        <w:rPr>
+          <w:rFonts w:ascii="Times New Roman" w:eastAsia="Times New Roman" w:hAnsi="Times New Roman" w:cs="Times New Roman"/>
+          <w:sz w:val="24"/>
+          <w:szCs w:val="24"/>
+        </w:rPr>
+        <w:t>_</w:t>
+      </w:r>
+      <w:proofErr w:type="gramStart"/>
+      <w:r>
+        <w:rPr>
+          <w:rFonts w:ascii="Times New Roman" w:eastAsia="Times New Roman" w:hAnsi="Times New Roman" w:cs="Times New Roman"/>
+          <w:sz w:val="24"/>
+          <w:szCs w:val="24"/>
+        </w:rPr>
+        <w:t>checkbox</w:t>
+      </w:r>
+      <w:proofErr w:type="spellEnd"/>
+      <w:r>
+        <w:rPr>
+          <w:rFonts w:ascii="Times New Roman" w:eastAsia="Times New Roman" w:hAnsi="Times New Roman" w:cs="Times New Roman"/>
+          <w:sz w:val="24"/>
+          <w:szCs w:val="24"/>
+        </w:rPr>
+        <w:t>(</w:t>
+      </w:r>
+      <w:r>
+        <w:rPr>
+          <w:rFonts w:ascii="Times New Roman" w:eastAsia="Times New Roman" w:hAnsi="Times New Roman" w:cs="Times New Roman"/>
+          <w:sz w:val="24"/>
+          <w:szCs w:val="24"/>
+        </w:rPr>
+        <w:t xml:space="preserve"> </w:t>
+      </w:r>
+      <w:proofErr w:type="spellStart"/>
+      <w:r>
+        <w:rPr>
+          <w:rFonts w:ascii="Times New Roman" w:eastAsia="Times New Roman" w:hAnsi="Times New Roman" w:cs="Times New Roman"/>
+          <w:sz w:val="24"/>
+          <w:szCs w:val="24"/>
+        </w:rPr>
+        <w:t>adpt</w:t>
+      </w:r>
+      <w:proofErr w:type="gramEnd"/>
+      <w:r>
+        <w:rPr>
+          <w:rFonts w:ascii="Times New Roman" w:eastAsia="Times New Roman" w:hAnsi="Times New Roman" w:cs="Times New Roman"/>
+          <w:sz w:val="24"/>
+          <w:szCs w:val="24"/>
+        </w:rPr>
+        <w:t>_speech_text</w:t>
+      </w:r>
+      <w:proofErr w:type="spellEnd"/>
+      <w:proofErr w:type="gramStart"/>
+      <w:r>
+        <w:rPr>
+          <w:rFonts w:ascii="Times New Roman" w:eastAsia="Times New Roman" w:hAnsi="Times New Roman" w:cs="Times New Roman"/>
+          <w:sz w:val="24"/>
+          <w:szCs w:val="24"/>
+        </w:rPr>
+        <w:t>) }</w:t>
+      </w:r>
+      <w:proofErr w:type="gramEnd"/>
+      <w:r>
+        <w:rPr>
+          <w:rFonts w:ascii="Times New Roman" w:eastAsia="Times New Roman" w:hAnsi="Times New Roman" w:cs="Times New Roman"/>
+          <w:sz w:val="24"/>
+          <w:szCs w:val="24"/>
+        </w:rPr>
+        <w:t xml:space="preserve">} speech-to-text tools </w:t>
+      </w:r>
+    </w:p>
+    <w:p>
+      <w:pPr>
+        <w:spacing w:after="0" w:line="240" w:lineRule="auto"/>
+        <w:ind w:firstLine="720"/>
+        <w:rPr>
+          <w:rFonts w:ascii="Times New Roman" w:eastAsia="Times New Roman" w:hAnsi="Times New Roman" w:cs="Times New Roman"/>
+          <w:sz w:val="24"/>
+          <w:szCs w:val="24"/>
+        </w:rPr>
+      </w:pPr>
+      <w:proofErr w:type="gramStart"/>
+      <w:r>
+        <w:rPr>
+          <w:rFonts w:ascii="Times New Roman" w:eastAsia="Times New Roman" w:hAnsi="Times New Roman" w:cs="Times New Roman"/>
+          <w:sz w:val="24"/>
+          <w:szCs w:val="24"/>
+        </w:rPr>
+        <w:lastRenderedPageBreak/>
+        <w:t>{{</w:t>
+      </w:r>
+      <w:r>
+        <w:rPr>
+          <w:rFonts w:ascii="Times New Roman" w:eastAsia="Times New Roman" w:hAnsi="Times New Roman" w:cs="Times New Roman"/>
+          <w:sz w:val="24"/>
+          <w:szCs w:val="24"/>
+        </w:rPr>
+        <w:t xml:space="preserve"> </w:t>
+      </w:r>
+      <w:proofErr w:type="spellStart"/>
+      <w:r>
+        <w:rPr>
+          <w:rFonts w:ascii="Times New Roman" w:eastAsia="Times New Roman" w:hAnsi="Times New Roman" w:cs="Times New Roman"/>
+          <w:sz w:val="24"/>
+          <w:szCs w:val="24"/>
+        </w:rPr>
+        <w:t>output</w:t>
+      </w:r>
+      <w:proofErr w:type="gramEnd"/>
+      <w:r>
+        <w:rPr>
+          <w:rFonts w:ascii="Times New Roman" w:eastAsia="Times New Roman" w:hAnsi="Times New Roman" w:cs="Times New Roman"/>
+          <w:sz w:val="24"/>
+          <w:szCs w:val="24"/>
+        </w:rPr>
+        <w:t>_</w:t>
+      </w:r>
+      <w:proofErr w:type="gramStart"/>
+      <w:r>
+        <w:rPr>
+          <w:rFonts w:ascii="Times New Roman" w:eastAsia="Times New Roman" w:hAnsi="Times New Roman" w:cs="Times New Roman"/>
+          <w:sz w:val="24"/>
+          <w:szCs w:val="24"/>
+        </w:rPr>
+        <w:t>checkbox</w:t>
+      </w:r>
+      <w:proofErr w:type="spellEnd"/>
+      <w:r>
+        <w:rPr>
+          <w:rFonts w:ascii="Times New Roman" w:eastAsia="Times New Roman" w:hAnsi="Times New Roman" w:cs="Times New Roman"/>
+          <w:sz w:val="24"/>
+          <w:szCs w:val="24"/>
+        </w:rPr>
+        <w:t>(</w:t>
+      </w:r>
+      <w:r>
+        <w:rPr>
+          <w:rFonts w:ascii="Times New Roman" w:eastAsia="Times New Roman" w:hAnsi="Times New Roman" w:cs="Times New Roman"/>
+          <w:sz w:val="24"/>
+          <w:szCs w:val="24"/>
+        </w:rPr>
+        <w:t xml:space="preserve"> </w:t>
+      </w:r>
+      <w:proofErr w:type="spellStart"/>
+      <w:r>
+        <w:rPr>
+          <w:rFonts w:ascii="Times New Roman" w:eastAsia="Times New Roman" w:hAnsi="Times New Roman" w:cs="Times New Roman"/>
+          <w:sz w:val="24"/>
+          <w:szCs w:val="24"/>
+        </w:rPr>
+        <w:t>adpt</w:t>
+      </w:r>
+      <w:proofErr w:type="gramEnd"/>
+      <w:r>
+        <w:rPr>
+          <w:rFonts w:ascii="Times New Roman" w:eastAsia="Times New Roman" w:hAnsi="Times New Roman" w:cs="Times New Roman"/>
+          <w:sz w:val="24"/>
+          <w:szCs w:val="24"/>
+        </w:rPr>
+        <w:t>_text_speech</w:t>
+      </w:r>
+      <w:proofErr w:type="spellEnd"/>
+      <w:proofErr w:type="gramStart"/>
+      <w:r>
+        <w:rPr>
+          <w:rFonts w:ascii="Times New Roman" w:eastAsia="Times New Roman" w:hAnsi="Times New Roman" w:cs="Times New Roman"/>
+          <w:sz w:val="24"/>
+          <w:szCs w:val="24"/>
+        </w:rPr>
+        <w:t>) }</w:t>
+      </w:r>
+      <w:proofErr w:type="gramEnd"/>
+      <w:r>
+        <w:rPr>
+          <w:rFonts w:ascii="Times New Roman" w:eastAsia="Times New Roman" w:hAnsi="Times New Roman" w:cs="Times New Roman"/>
+          <w:sz w:val="24"/>
+          <w:szCs w:val="24"/>
+        </w:rPr>
+        <w:t xml:space="preserve">} text-to-speech tools </w:t>
+      </w:r>
+    </w:p>
+    <w:p>
+      <w:pPr>
+        <w:spacing w:after="0" w:line="240" w:lineRule="auto"/>
+        <w:ind w:firstLine="720"/>
+        <w:rPr>
+          <w:rFonts w:ascii="Times New Roman" w:eastAsia="Times New Roman" w:hAnsi="Times New Roman" w:cs="Times New Roman"/>
+          <w:sz w:val="24"/>
+          <w:szCs w:val="24"/>
+        </w:rPr>
+      </w:pPr>
+      <w:proofErr w:type="gramStart"/>
+      <w:r>
+        <w:rPr>
+          <w:rFonts w:ascii="Times New Roman" w:eastAsia="Times New Roman" w:hAnsi="Times New Roman" w:cs="Times New Roman"/>
+          <w:sz w:val="24"/>
+          <w:szCs w:val="24"/>
+        </w:rPr>
+        <w:t>{{</w:t>
+      </w:r>
+      <w:r>
+        <w:rPr>
+          <w:rFonts w:ascii="Times New Roman" w:eastAsia="Times New Roman" w:hAnsi="Times New Roman" w:cs="Times New Roman"/>
+          <w:sz w:val="24"/>
+          <w:szCs w:val="24"/>
+        </w:rPr>
+        <w:t xml:space="preserve"> </w:t>
+      </w:r>
+      <w:proofErr w:type="spellStart"/>
+      <w:r>
+        <w:rPr>
+          <w:rFonts w:ascii="Times New Roman" w:eastAsia="Times New Roman" w:hAnsi="Times New Roman" w:cs="Times New Roman"/>
+          <w:sz w:val="24"/>
+          <w:szCs w:val="24"/>
+        </w:rPr>
+        <w:t>output</w:t>
+      </w:r>
+      <w:proofErr w:type="gramEnd"/>
+      <w:r>
+        <w:rPr>
+          <w:rFonts w:ascii="Times New Roman" w:eastAsia="Times New Roman" w:hAnsi="Times New Roman" w:cs="Times New Roman"/>
+          <w:sz w:val="24"/>
+          <w:szCs w:val="24"/>
+        </w:rPr>
+        <w:t>_</w:t>
+      </w:r>
+      <w:proofErr w:type="gramStart"/>
+      <w:r>
+        <w:rPr>
+          <w:rFonts w:ascii="Times New Roman" w:eastAsia="Times New Roman" w:hAnsi="Times New Roman" w:cs="Times New Roman"/>
+          <w:sz w:val="24"/>
+          <w:szCs w:val="24"/>
+        </w:rPr>
+        <w:t>checkbox</w:t>
+      </w:r>
+      <w:proofErr w:type="spellEnd"/>
+      <w:r>
+        <w:rPr>
+          <w:rFonts w:ascii="Times New Roman" w:eastAsia="Times New Roman" w:hAnsi="Times New Roman" w:cs="Times New Roman"/>
+          <w:sz w:val="24"/>
+          <w:szCs w:val="24"/>
+        </w:rPr>
+        <w:t>(</w:t>
+      </w:r>
+      <w:r>
+        <w:rPr>
+          <w:rFonts w:ascii="Times New Roman" w:eastAsia="Times New Roman" w:hAnsi="Times New Roman" w:cs="Times New Roman"/>
+          <w:sz w:val="24"/>
+          <w:szCs w:val="24"/>
+        </w:rPr>
+        <w:t xml:space="preserve"> </w:t>
+      </w:r>
+      <w:proofErr w:type="spellStart"/>
+      <w:r>
+        <w:rPr>
+          <w:rFonts w:ascii="Times New Roman" w:eastAsia="Times New Roman" w:hAnsi="Times New Roman" w:cs="Times New Roman"/>
+          <w:sz w:val="24"/>
+          <w:szCs w:val="24"/>
+        </w:rPr>
+        <w:t>adpt</w:t>
+      </w:r>
+      <w:proofErr w:type="gramEnd"/>
+      <w:r>
+        <w:rPr>
+          <w:rFonts w:ascii="Times New Roman" w:eastAsia="Times New Roman" w:hAnsi="Times New Roman" w:cs="Times New Roman"/>
+          <w:sz w:val="24"/>
+          <w:szCs w:val="24"/>
+        </w:rPr>
+        <w:t>_cc</w:t>
+      </w:r>
+      <w:proofErr w:type="spellEnd"/>
+      <w:proofErr w:type="gramStart"/>
+      <w:r>
+        <w:rPr>
+          <w:rFonts w:ascii="Times New Roman" w:eastAsia="Times New Roman" w:hAnsi="Times New Roman" w:cs="Times New Roman"/>
+          <w:sz w:val="24"/>
+          <w:szCs w:val="24"/>
+        </w:rPr>
+        <w:t>) }</w:t>
+      </w:r>
+      <w:proofErr w:type="gramEnd"/>
+      <w:r>
+        <w:rPr>
+          <w:rFonts w:ascii="Times New Roman" w:eastAsia="Times New Roman" w:hAnsi="Times New Roman" w:cs="Times New Roman"/>
+          <w:sz w:val="24"/>
+          <w:szCs w:val="24"/>
+        </w:rPr>
+        <w:t xml:space="preserve">} closed captioning during virtual meetings </w:t>
+      </w:r>
+    </w:p>
+    <w:p>
+      <w:pPr>
+        <w:spacing w:after="0" w:line="240" w:lineRule="auto"/>
+        <w:rPr>
+          <w:rFonts w:ascii="Times New Roman" w:eastAsia="Times New Roman" w:hAnsi="Times New Roman" w:cs="Times New Roman"/>
+          <w:sz w:val="24"/>
+          <w:szCs w:val="24"/>
+        </w:rPr>
+      </w:pPr>
+      <w:r>
+        <w:rPr>
+          <w:rFonts w:ascii="Times New Roman" w:eastAsia="Times New Roman" w:hAnsi="Times New Roman" w:cs="Times New Roman"/>
+          <w:sz w:val="24"/>
+          <w:szCs w:val="24"/>
+        </w:rPr>
+        <w:t>interpretation and translation services, such as</w:t>
+      </w:r>
+    </w:p>
+    <w:p>
+      <w:pPr>
+        <w:spacing w:after="0" w:line="240" w:lineRule="auto"/>
+        <w:rPr>
+          <w:rFonts w:ascii="Times New Roman" w:eastAsia="Times New Roman" w:hAnsi="Times New Roman" w:cs="Times New Roman"/>
+          <w:sz w:val="24"/>
+          <w:szCs w:val="24"/>
+        </w:rPr>
+      </w:pPr>
+      <w:r>
+        <w:rPr>
+          <w:rFonts w:ascii="Times New Roman" w:eastAsia="Times New Roman" w:hAnsi="Times New Roman" w:cs="Times New Roman"/>
+          <w:sz w:val="24"/>
+          <w:szCs w:val="24"/>
+        </w:rPr>
+        <w:tab/>
+      </w:r>
+      <w:proofErr w:type="gramStart"/>
+      <w:r>
+        <w:rPr>
+          <w:rFonts w:ascii="Times New Roman" w:eastAsia="Times New Roman" w:hAnsi="Times New Roman" w:cs="Times New Roman"/>
+          <w:sz w:val="24"/>
+          <w:szCs w:val="24"/>
+        </w:rPr>
+        <w:t>{{</w:t>
+      </w:r>
+      <w:r>
+        <w:rPr>
+          <w:rFonts w:ascii="Times New Roman" w:eastAsia="Times New Roman" w:hAnsi="Times New Roman" w:cs="Times New Roman"/>
+          <w:sz w:val="24"/>
+          <w:szCs w:val="24"/>
+        </w:rPr>
+        <w:t xml:space="preserve"> </w:t>
+      </w:r>
+      <w:proofErr w:type="spellStart"/>
+      <w:r>
+        <w:rPr>
+          <w:rFonts w:ascii="Times New Roman" w:eastAsia="Times New Roman" w:hAnsi="Times New Roman" w:cs="Times New Roman"/>
+          <w:sz w:val="24"/>
+          <w:szCs w:val="24"/>
+        </w:rPr>
+        <w:t>output</w:t>
+      </w:r>
+      <w:proofErr w:type="gramEnd"/>
+      <w:r>
+        <w:rPr>
+          <w:rFonts w:ascii="Times New Roman" w:eastAsia="Times New Roman" w:hAnsi="Times New Roman" w:cs="Times New Roman"/>
+          <w:sz w:val="24"/>
+          <w:szCs w:val="24"/>
+        </w:rPr>
+        <w:t>_</w:t>
+      </w:r>
+      <w:proofErr w:type="gramStart"/>
+      <w:r>
+        <w:rPr>
+          <w:rFonts w:ascii="Times New Roman" w:eastAsia="Times New Roman" w:hAnsi="Times New Roman" w:cs="Times New Roman"/>
+          <w:sz w:val="24"/>
+          <w:szCs w:val="24"/>
+        </w:rPr>
+        <w:t>checkbox</w:t>
+      </w:r>
+      <w:proofErr w:type="spellEnd"/>
+      <w:r>
+        <w:rPr>
+          <w:rFonts w:ascii="Times New Roman" w:eastAsia="Times New Roman" w:hAnsi="Times New Roman" w:cs="Times New Roman"/>
+          <w:sz w:val="24"/>
+          <w:szCs w:val="24"/>
+        </w:rPr>
+        <w:t>(</w:t>
+      </w:r>
+      <w:r>
+        <w:rPr>
+          <w:rFonts w:ascii="Times New Roman" w:eastAsia="Times New Roman" w:hAnsi="Times New Roman" w:cs="Times New Roman"/>
+          <w:sz w:val="24"/>
+          <w:szCs w:val="24"/>
+        </w:rPr>
+        <w:t xml:space="preserve"> </w:t>
+      </w:r>
+      <w:proofErr w:type="spellStart"/>
+      <w:r>
+        <w:rPr>
+          <w:rFonts w:ascii="Times New Roman" w:eastAsia="Times New Roman" w:hAnsi="Times New Roman" w:cs="Times New Roman"/>
+          <w:sz w:val="24"/>
+          <w:szCs w:val="24"/>
+        </w:rPr>
+        <w:t>trans</w:t>
+      </w:r>
+      <w:proofErr w:type="gramEnd"/>
+      <w:r>
+        <w:rPr>
+          <w:rFonts w:ascii="Times New Roman" w:eastAsia="Times New Roman" w:hAnsi="Times New Roman" w:cs="Times New Roman"/>
+          <w:sz w:val="24"/>
+          <w:szCs w:val="24"/>
+        </w:rPr>
+        <w:t>_asl</w:t>
+      </w:r>
+      <w:proofErr w:type="spellEnd"/>
+      <w:proofErr w:type="gramStart"/>
+      <w:r>
+        <w:rPr>
+          <w:rFonts w:ascii="Times New Roman" w:eastAsia="Times New Roman" w:hAnsi="Times New Roman" w:cs="Times New Roman"/>
+          <w:sz w:val="24"/>
+          <w:szCs w:val="24"/>
+        </w:rPr>
+        <w:t>) }</w:t>
+      </w:r>
+      <w:proofErr w:type="gramEnd"/>
+      <w:r>
+        <w:rPr>
+          <w:rFonts w:ascii="Times New Roman" w:eastAsia="Times New Roman" w:hAnsi="Times New Roman" w:cs="Times New Roman"/>
+          <w:sz w:val="24"/>
+          <w:szCs w:val="24"/>
+        </w:rPr>
+        <w:t>} American Sign Language</w:t>
+      </w:r>
+    </w:p>
+    <w:p>
+      <w:pPr>
+        <w:spacing w:after="0" w:line="240" w:lineRule="auto"/>
+        <w:rPr>
+          <w:rFonts w:ascii="Times New Roman" w:eastAsia="Times New Roman" w:hAnsi="Times New Roman" w:cs="Times New Roman"/>
+          <w:sz w:val="24"/>
+          <w:szCs w:val="24"/>
+        </w:rPr>
+      </w:pPr>
+      <w:r>
+        <w:rPr>
+          <w:rFonts w:ascii="Times New Roman" w:eastAsia="Times New Roman" w:hAnsi="Times New Roman" w:cs="Times New Roman"/>
+          <w:sz w:val="24"/>
+          <w:szCs w:val="24"/>
+        </w:rPr>
+        <w:tab/>
+      </w:r>
+      <w:proofErr w:type="gramStart"/>
+      <w:r>
+        <w:rPr>
+          <w:rFonts w:ascii="Times New Roman" w:eastAsia="Times New Roman" w:hAnsi="Times New Roman" w:cs="Times New Roman"/>
+          <w:sz w:val="24"/>
+          <w:szCs w:val="24"/>
+        </w:rPr>
+        <w:t>{{</w:t>
+      </w:r>
+      <w:r>
+        <w:rPr>
+          <w:rFonts w:ascii="Times New Roman" w:eastAsia="Times New Roman" w:hAnsi="Times New Roman" w:cs="Times New Roman"/>
+          <w:sz w:val="24"/>
+          <w:szCs w:val="24"/>
+        </w:rPr>
+        <w:t xml:space="preserve"> </w:t>
+      </w:r>
+      <w:proofErr w:type="spellStart"/>
+      <w:r>
+        <w:rPr>
+          <w:rFonts w:ascii="Times New Roman" w:eastAsia="Times New Roman" w:hAnsi="Times New Roman" w:cs="Times New Roman"/>
+          <w:sz w:val="24"/>
+          <w:szCs w:val="24"/>
+        </w:rPr>
+        <w:t>output</w:t>
+      </w:r>
+      <w:proofErr w:type="gramEnd"/>
+      <w:r>
+        <w:rPr>
+          <w:rFonts w:ascii="Times New Roman" w:eastAsia="Times New Roman" w:hAnsi="Times New Roman" w:cs="Times New Roman"/>
+          <w:sz w:val="24"/>
+          <w:szCs w:val="24"/>
+        </w:rPr>
+        <w:t>_</w:t>
+      </w:r>
+      <w:proofErr w:type="gramStart"/>
+      <w:r>
+        <w:rPr>
+          <w:rFonts w:ascii="Times New Roman" w:eastAsia="Times New Roman" w:hAnsi="Times New Roman" w:cs="Times New Roman"/>
+          <w:sz w:val="24"/>
+          <w:szCs w:val="24"/>
+        </w:rPr>
+        <w:t>checkbox</w:t>
+      </w:r>
+      <w:proofErr w:type="spellEnd"/>
+      <w:r>
+        <w:rPr>
+          <w:rFonts w:ascii="Times New Roman" w:eastAsia="Times New Roman" w:hAnsi="Times New Roman" w:cs="Times New Roman"/>
+          <w:sz w:val="24"/>
+          <w:szCs w:val="24"/>
+        </w:rPr>
+        <w:t>(</w:t>
+      </w:r>
+      <w:r>
+        <w:rPr>
+          <w:rFonts w:ascii="Times New Roman" w:eastAsia="Times New Roman" w:hAnsi="Times New Roman" w:cs="Times New Roman"/>
+          <w:sz w:val="24"/>
+          <w:szCs w:val="24"/>
+        </w:rPr>
+        <w:t xml:space="preserve"> </w:t>
+      </w:r>
+      <w:proofErr w:type="spellStart"/>
+      <w:r>
+        <w:rPr>
+          <w:rFonts w:ascii="Times New Roman" w:eastAsia="Times New Roman" w:hAnsi="Times New Roman" w:cs="Times New Roman"/>
+          <w:sz w:val="24"/>
+          <w:szCs w:val="24"/>
+        </w:rPr>
+        <w:t>trans</w:t>
+      </w:r>
+      <w:proofErr w:type="gramEnd"/>
+      <w:r>
+        <w:rPr>
+          <w:rFonts w:ascii="Times New Roman" w:eastAsia="Times New Roman" w:hAnsi="Times New Roman" w:cs="Times New Roman"/>
+          <w:sz w:val="24"/>
+          <w:szCs w:val="24"/>
+        </w:rPr>
+        <w:t>_cdi</w:t>
+      </w:r>
+      <w:proofErr w:type="spellEnd"/>
+      <w:proofErr w:type="gramStart"/>
+      <w:r>
+        <w:rPr>
+          <w:rFonts w:ascii="Times New Roman" w:eastAsia="Times New Roman" w:hAnsi="Times New Roman" w:cs="Times New Roman"/>
+          <w:sz w:val="24"/>
+          <w:szCs w:val="24"/>
+        </w:rPr>
+        <w:t>) }</w:t>
+      </w:r>
+      <w:proofErr w:type="gramEnd"/>
+      <w:r>
+        <w:rPr>
+          <w:rFonts w:ascii="Times New Roman" w:eastAsia="Times New Roman" w:hAnsi="Times New Roman" w:cs="Times New Roman"/>
+          <w:sz w:val="24"/>
+          <w:szCs w:val="24"/>
+        </w:rPr>
+        <w:t>} Certified Deaf Interpreter</w:t>
+      </w:r>
+    </w:p>
+    <w:p>
+      <w:pPr>
+        <w:spacing w:after="0" w:line="240" w:lineRule="auto"/>
+        <w:rPr>
+          <w:rFonts w:ascii="Times New Roman" w:eastAsia="Times New Roman" w:hAnsi="Times New Roman" w:cs="Times New Roman"/>
+          <w:sz w:val="24"/>
+          <w:szCs w:val="24"/>
+        </w:rPr>
+      </w:pPr>
+      <w:r>
+        <w:rPr>
+          <w:rFonts w:ascii="Times New Roman" w:eastAsia="Times New Roman" w:hAnsi="Times New Roman" w:cs="Times New Roman"/>
+          <w:sz w:val="24"/>
+          <w:szCs w:val="24"/>
+        </w:rPr>
+        <w:tab/>
+      </w:r>
+      <w:proofErr w:type="gramStart"/>
+      <w:r>
+        <w:rPr>
+          <w:rFonts w:ascii="Times New Roman" w:eastAsia="Times New Roman" w:hAnsi="Times New Roman" w:cs="Times New Roman"/>
+          <w:sz w:val="24"/>
+          <w:szCs w:val="24"/>
+        </w:rPr>
+        <w:t>{{</w:t>
+      </w:r>
+      <w:r>
+        <w:rPr>
+          <w:rFonts w:ascii="Times New Roman" w:eastAsia="Times New Roman" w:hAnsi="Times New Roman" w:cs="Times New Roman"/>
+          <w:sz w:val="24"/>
+          <w:szCs w:val="24"/>
+        </w:rPr>
+        <w:t xml:space="preserve"> </w:t>
+      </w:r>
+      <w:proofErr w:type="spellStart"/>
+      <w:r>
+        <w:rPr>
+          <w:rFonts w:ascii="Times New Roman" w:eastAsia="Times New Roman" w:hAnsi="Times New Roman" w:cs="Times New Roman"/>
+          <w:sz w:val="24"/>
+          <w:szCs w:val="24"/>
+        </w:rPr>
+        <w:t>output</w:t>
+      </w:r>
+      <w:proofErr w:type="gramEnd"/>
+      <w:r>
+        <w:rPr>
+          <w:rFonts w:ascii="Times New Roman" w:eastAsia="Times New Roman" w:hAnsi="Times New Roman" w:cs="Times New Roman"/>
+          <w:sz w:val="24"/>
+          <w:szCs w:val="24"/>
+        </w:rPr>
+        <w:t>_</w:t>
+      </w:r>
+      <w:proofErr w:type="gramStart"/>
+      <w:r>
+        <w:rPr>
+          <w:rFonts w:ascii="Times New Roman" w:eastAsia="Times New Roman" w:hAnsi="Times New Roman" w:cs="Times New Roman"/>
+          <w:sz w:val="24"/>
+          <w:szCs w:val="24"/>
+        </w:rPr>
+        <w:t>checkbox</w:t>
+      </w:r>
+      <w:proofErr w:type="spellEnd"/>
+      <w:r>
+        <w:rPr>
+          <w:rFonts w:ascii="Times New Roman" w:eastAsia="Times New Roman" w:hAnsi="Times New Roman" w:cs="Times New Roman"/>
+          <w:sz w:val="24"/>
+          <w:szCs w:val="24"/>
+        </w:rPr>
+        <w:t>(</w:t>
+      </w:r>
+      <w:r>
+        <w:rPr>
+          <w:rFonts w:ascii="Times New Roman" w:eastAsia="Times New Roman" w:hAnsi="Times New Roman" w:cs="Times New Roman"/>
+          <w:sz w:val="24"/>
+          <w:szCs w:val="24"/>
+        </w:rPr>
+        <w:t xml:space="preserve"> </w:t>
+      </w:r>
+      <w:proofErr w:type="spellStart"/>
+      <w:r>
+        <w:rPr>
+          <w:rFonts w:ascii="Times New Roman" w:eastAsia="Times New Roman" w:hAnsi="Times New Roman" w:cs="Times New Roman"/>
+          <w:sz w:val="24"/>
+          <w:szCs w:val="24"/>
+        </w:rPr>
+        <w:t>trans</w:t>
+      </w:r>
+      <w:proofErr w:type="gramEnd"/>
+      <w:r>
+        <w:rPr>
+          <w:rFonts w:ascii="Times New Roman" w:eastAsia="Times New Roman" w:hAnsi="Times New Roman" w:cs="Times New Roman"/>
+          <w:sz w:val="24"/>
+          <w:szCs w:val="24"/>
+        </w:rPr>
+        <w:t>_cart</w:t>
+      </w:r>
+      <w:proofErr w:type="spellEnd"/>
+      <w:proofErr w:type="gramStart"/>
+      <w:r>
+        <w:rPr>
+          <w:rFonts w:ascii="Times New Roman" w:eastAsia="Times New Roman" w:hAnsi="Times New Roman" w:cs="Times New Roman"/>
+          <w:sz w:val="24"/>
+          <w:szCs w:val="24"/>
+        </w:rPr>
+        <w:t>) }}Communications</w:t>
+      </w:r>
+      <w:proofErr w:type="gramEnd"/>
+      <w:r>
+        <w:rPr>
+          <w:rFonts w:ascii="Times New Roman" w:eastAsia="Times New Roman" w:hAnsi="Times New Roman" w:cs="Times New Roman"/>
+          <w:sz w:val="24"/>
+          <w:szCs w:val="24"/>
+        </w:rPr>
+        <w:t xml:space="preserve"> Access Real-time Translation (CART)</w:t>
+      </w:r>
+    </w:p>
+    <w:p>
+      <w:pPr>
+        <w:spacing w:after="0" w:line="240" w:lineRule="auto"/>
+        <w:rPr>
+          <w:rFonts w:ascii="Times New Roman" w:eastAsia="Times New Roman" w:hAnsi="Times New Roman" w:cs="Times New Roman"/>
+          <w:sz w:val="24"/>
+          <w:szCs w:val="24"/>
+        </w:rPr>
+      </w:pPr>
+      <w:r>
+        <w:rPr>
+          <w:rFonts w:ascii="Times New Roman" w:eastAsia="Times New Roman" w:hAnsi="Times New Roman" w:cs="Times New Roman"/>
+          <w:sz w:val="24"/>
+          <w:szCs w:val="24"/>
+        </w:rPr>
+        <w:t xml:space="preserve">{%if </w:t>
+      </w:r>
+      <w:proofErr w:type="spellStart"/>
+      <w:r>
+        <w:rPr>
+          <w:rFonts w:ascii="Times New Roman" w:eastAsia="Times New Roman" w:hAnsi="Times New Roman" w:cs="Times New Roman"/>
+          <w:sz w:val="24"/>
+          <w:szCs w:val="24"/>
+        </w:rPr>
+        <w:t>other_any_one</w:t>
+      </w:r>
+      <w:proofErr w:type="spellEnd"/>
+      <w:r>
+        <w:rPr>
+          <w:rFonts w:ascii="Times New Roman" w:eastAsia="Times New Roman" w:hAnsi="Times New Roman" w:cs="Times New Roman"/>
+          <w:sz w:val="24"/>
+          <w:szCs w:val="24"/>
+        </w:rPr>
+        <w:t xml:space="preserve"> | length &gt; </w:t>
+      </w:r>
+      <w:r>
+        <w:rPr>
+          <w:rFonts w:ascii="Times New Roman" w:eastAsia="Times New Roman" w:hAnsi="Times New Roman" w:cs="Times New Roman"/>
+          <w:sz w:val="24"/>
+          <w:szCs w:val="24"/>
+        </w:rPr>
+        <w:t>0</w:t>
+      </w:r>
+      <w:r>
+        <w:rPr>
+          <w:rFonts w:ascii="Times New Roman" w:eastAsia="Times New Roman" w:hAnsi="Times New Roman" w:cs="Times New Roman"/>
+          <w:sz w:val="24"/>
+          <w:szCs w:val="24"/>
+        </w:rPr>
+        <w:t xml:space="preserve"> %}[X</w:t>
+      </w:r>
+      <w:r>
+        <w:rPr>
+          <w:rFonts w:ascii="Times New Roman" w:eastAsia="Times New Roman" w:hAnsi="Times New Roman" w:cs="Times New Roman"/>
+          <w:sz w:val="24"/>
+          <w:szCs w:val="24"/>
+        </w:rPr>
+        <w:t xml:space="preserve">] </w:t>
+      </w:r>
+      <w:r>
+        <w:rPr>
+          <w:rFonts w:ascii="Times New Roman" w:eastAsia="Times New Roman" w:hAnsi="Times New Roman" w:cs="Times New Roman"/>
+          <w:sz w:val="24"/>
+          <w:szCs w:val="24"/>
+        </w:rPr>
+        <w:t>{% else %} [  ]</w:t>
+      </w:r>
+      <w:r>
+        <w:rPr>
+          <w:rFonts w:ascii="Times New Roman" w:eastAsia="Times New Roman" w:hAnsi="Times New Roman" w:cs="Times New Roman"/>
+          <w:sz w:val="24"/>
+          <w:szCs w:val="24"/>
+        </w:rPr>
+        <w:t>{% endif %}</w:t>
+      </w:r>
+      <w:r>
+        <w:rPr>
+          <w:rFonts w:ascii="Times New Roman" w:eastAsia="Times New Roman" w:hAnsi="Times New Roman" w:cs="Times New Roman"/>
+          <w:sz w:val="24"/>
+          <w:szCs w:val="24"/>
+        </w:rPr>
+        <w:t>O</w:t>
+      </w:r>
+      <w:r>
+        <w:rPr>
+          <w:rFonts w:ascii="Times New Roman" w:eastAsia="Times New Roman" w:hAnsi="Times New Roman" w:cs="Times New Roman"/>
+          <w:sz w:val="24"/>
+          <w:szCs w:val="24"/>
+        </w:rPr>
+        <w:t xml:space="preserve">ther: </w:t>
+      </w:r>
+      <w:r>
+        <w:rPr>
+          <w:rFonts w:ascii="Times New Roman" w:eastAsia="Times New Roman" w:hAnsi="Times New Roman" w:cs="Times New Roman"/>
+          <w:sz w:val="24"/>
+          <w:szCs w:val="24"/>
+        </w:rPr>
+        <w:t xml:space="preserve">{{ </w:t>
+      </w:r>
+      <w:proofErr w:type="spellStart"/>
+      <w:r>
+        <w:rPr>
+          <w:rFonts w:ascii="Times New Roman" w:eastAsia="Times New Roman" w:hAnsi="Times New Roman" w:cs="Times New Roman"/>
+          <w:sz w:val="24"/>
+          <w:szCs w:val="24"/>
+        </w:rPr>
+        <w:t>other_any_one</w:t>
+      </w:r>
+      <w:proofErr w:type="spellEnd"/>
+      <w:r>
+        <w:rPr>
+          <w:rFonts w:ascii="Times New Roman" w:eastAsia="Times New Roman" w:hAnsi="Times New Roman" w:cs="Times New Roman"/>
+          <w:sz w:val="24"/>
+          <w:szCs w:val="24"/>
+        </w:rPr>
+        <w:t xml:space="preserve"> }}</w:t>
+      </w:r>
+    </w:p>
+    <w:p>
+      <w:pPr>
+        <w:spacing w:after="0" w:line="240" w:lineRule="auto"/>
+        <w:ind w:firstLine="720"/>
+        <w:rPr>
+          <w:rFonts w:ascii="Times New Roman" w:eastAsia="Times New Roman" w:hAnsi="Times New Roman" w:cs="Times New Roman"/>
+          <w:sz w:val="24"/>
+          <w:szCs w:val="24"/>
+        </w:rPr>
+      </w:pPr>
+      <w:proofErr w:type="gramStart"/>
+      <w:r>
+        <w:rPr>
+          <w:rFonts w:ascii="Times New Roman" w:eastAsia="Times New Roman" w:hAnsi="Times New Roman" w:cs="Times New Roman"/>
+          <w:sz w:val="24"/>
+          <w:szCs w:val="24"/>
+        </w:rPr>
+        <w:t xml:space="preserve">{{ </w:t>
+      </w:r>
+      <w:proofErr w:type="spellStart"/>
+      <w:r>
+        <w:rPr>
+          <w:rFonts w:ascii="Times New Roman" w:eastAsia="Times New Roman" w:hAnsi="Times New Roman" w:cs="Times New Roman"/>
+          <w:sz w:val="24"/>
+          <w:szCs w:val="24"/>
+        </w:rPr>
+        <w:t>other</w:t>
+      </w:r>
+      <w:proofErr w:type="gramEnd"/>
+      <w:r>
+        <w:rPr>
+          <w:rFonts w:ascii="Times New Roman" w:eastAsia="Times New Roman" w:hAnsi="Times New Roman" w:cs="Times New Roman"/>
+          <w:sz w:val="24"/>
+          <w:szCs w:val="24"/>
+        </w:rPr>
+        <w:t>_any_</w:t>
+      </w:r>
+      <w:proofErr w:type="gramStart"/>
+      <w:r>
+        <w:rPr>
+          <w:rFonts w:ascii="Times New Roman" w:eastAsia="Times New Roman" w:hAnsi="Times New Roman" w:cs="Times New Roman"/>
+          <w:sz w:val="24"/>
+          <w:szCs w:val="24"/>
+        </w:rPr>
+        <w:t>two</w:t>
+      </w:r>
+      <w:proofErr w:type="spellEnd"/>
+      <w:r>
+        <w:rPr>
+          <w:rFonts w:ascii="Times New Roman" w:eastAsia="Times New Roman" w:hAnsi="Times New Roman" w:cs="Times New Roman"/>
+          <w:sz w:val="24"/>
+          <w:szCs w:val="24"/>
+        </w:rPr>
+        <w:t xml:space="preserve"> }</w:t>
+      </w:r>
+      <w:proofErr w:type="gramEnd"/>
+      <w:r>
+        <w:rPr>
+          <w:rFonts w:ascii="Times New Roman" w:eastAsia="Times New Roman" w:hAnsi="Times New Roman" w:cs="Times New Roman"/>
+          <w:sz w:val="24"/>
+          <w:szCs w:val="24"/>
+        </w:rPr>
+        <w:t>}</w:t>
+      </w:r>
     </w:p>
     <w:p>
       <w:pPr>
@@ -2044,7 +3137,6 @@
           <w:sz w:val="24"/>
           <w:szCs w:val="24"/>
         </w:rPr>
-        <w:lastRenderedPageBreak/>
         <w:t>I expect to hear from you in ten days. If I do not hear from you in writing in ten days, I will consider my request denied.</w:t>
       </w:r>
     </w:p>
@@ -2158,67 +3250,13 @@
           <w:szCs w:val="24"/>
         </w:rPr>
       </w:pPr>
-      <w:proofErr w:type="gramStart"/>
-      <w:r>
-        <w:rPr>
-          <w:rFonts w:ascii="Times New Roman" w:eastAsia="Times New Roman" w:hAnsi="Times New Roman" w:cs="Times New Roman"/>
-          <w:sz w:val="24"/>
-          <w:szCs w:val="24"/>
-        </w:rPr>
-        <w:t xml:space="preserve">{{ </w:t>
-      </w:r>
-      <w:proofErr w:type="spellStart"/>
-      <w:r>
-        <w:rPr>
-          <w:rFonts w:ascii="Times New Roman" w:eastAsia="Times New Roman" w:hAnsi="Times New Roman" w:cs="Times New Roman"/>
-          <w:sz w:val="24"/>
-          <w:szCs w:val="24"/>
-        </w:rPr>
-        <w:t>is</w:t>
-      </w:r>
-      <w:proofErr w:type="gramEnd"/>
-      <w:r>
-        <w:rPr>
-          <w:rFonts w:ascii="Times New Roman" w:eastAsia="Times New Roman" w:hAnsi="Times New Roman" w:cs="Times New Roman"/>
-          <w:sz w:val="24"/>
-          <w:szCs w:val="24"/>
-        </w:rPr>
-        <w:t>_bestcontact_</w:t>
-      </w:r>
-      <w:proofErr w:type="gramStart"/>
-      <w:r>
-        <w:rPr>
-          <w:rFonts w:ascii="Times New Roman" w:eastAsia="Times New Roman" w:hAnsi="Times New Roman" w:cs="Times New Roman"/>
-          <w:sz w:val="24"/>
-          <w:szCs w:val="24"/>
-        </w:rPr>
-        <w:t>phone</w:t>
-      </w:r>
-      <w:proofErr w:type="spellEnd"/>
-      <w:r>
-        <w:rPr>
-          <w:rFonts w:ascii="Times New Roman" w:eastAsia="Times New Roman" w:hAnsi="Times New Roman" w:cs="Times New Roman"/>
-          <w:sz w:val="24"/>
-          <w:szCs w:val="24"/>
-        </w:rPr>
-        <w:t xml:space="preserve"> }</w:t>
-      </w:r>
-      <w:proofErr w:type="gramEnd"/>
-      <w:r>
-        <w:rPr>
-          <w:rFonts w:ascii="Times New Roman" w:eastAsia="Times New Roman" w:hAnsi="Times New Roman" w:cs="Times New Roman"/>
-          <w:sz w:val="24"/>
-          <w:szCs w:val="24"/>
-        </w:rPr>
-        <w:t>}</w:t>
-      </w:r>
-      <w:r>
-        <w:rPr>
-          <w:rFonts w:ascii="Times New Roman" w:eastAsia="Times New Roman" w:hAnsi="Times New Roman" w:cs="Times New Roman"/>
-          <w:sz w:val="24"/>
-          <w:szCs w:val="24"/>
-        </w:rPr>
-        <w:t xml:space="preserve"> Phone</w:t>
+      <w:r>
+        <w:rPr>
+          <w:rFonts w:ascii="Times New Roman" w:eastAsia="Times New Roman" w:hAnsi="Times New Roman" w:cs="Times New Roman"/>
+          <w:sz w:val="24"/>
+          <w:szCs w:val="24"/>
+        </w:rPr>
+        <w:t>Phone</w:t>
       </w:r>
       <w:r>
         <w:rPr>
@@ -2327,67 +3365,13 @@
           <w:szCs w:val="24"/>
         </w:rPr>
       </w:pPr>
-      <w:proofErr w:type="gramStart"/>
-      <w:r>
-        <w:rPr>
-          <w:rFonts w:ascii="Times New Roman" w:eastAsia="Times New Roman" w:hAnsi="Times New Roman" w:cs="Times New Roman"/>
-          <w:sz w:val="24"/>
-          <w:szCs w:val="24"/>
-        </w:rPr>
-        <w:t xml:space="preserve">{{ </w:t>
-      </w:r>
-      <w:proofErr w:type="spellStart"/>
-      <w:r>
-        <w:rPr>
-          <w:rFonts w:ascii="Times New Roman" w:eastAsia="Times New Roman" w:hAnsi="Times New Roman" w:cs="Times New Roman"/>
-          <w:sz w:val="24"/>
-          <w:szCs w:val="24"/>
-        </w:rPr>
-        <w:t>is</w:t>
-      </w:r>
-      <w:proofErr w:type="gramEnd"/>
-      <w:r>
-        <w:rPr>
-          <w:rFonts w:ascii="Times New Roman" w:eastAsia="Times New Roman" w:hAnsi="Times New Roman" w:cs="Times New Roman"/>
-          <w:sz w:val="24"/>
-          <w:szCs w:val="24"/>
-        </w:rPr>
-        <w:t>_bestcontact_</w:t>
-      </w:r>
-      <w:proofErr w:type="gramStart"/>
-      <w:r>
-        <w:rPr>
-          <w:rFonts w:ascii="Times New Roman" w:eastAsia="Times New Roman" w:hAnsi="Times New Roman" w:cs="Times New Roman"/>
-          <w:sz w:val="24"/>
-          <w:szCs w:val="24"/>
-        </w:rPr>
-        <w:t>other</w:t>
-      </w:r>
-      <w:proofErr w:type="spellEnd"/>
-      <w:r>
-        <w:rPr>
-          <w:rFonts w:ascii="Times New Roman" w:eastAsia="Times New Roman" w:hAnsi="Times New Roman" w:cs="Times New Roman"/>
-          <w:sz w:val="24"/>
-          <w:szCs w:val="24"/>
-        </w:rPr>
-        <w:t xml:space="preserve"> }</w:t>
-      </w:r>
-      <w:proofErr w:type="gramEnd"/>
-      <w:r>
-        <w:rPr>
-          <w:rFonts w:ascii="Times New Roman" w:eastAsia="Times New Roman" w:hAnsi="Times New Roman" w:cs="Times New Roman"/>
-          <w:sz w:val="24"/>
-          <w:szCs w:val="24"/>
-        </w:rPr>
-        <w:t>}</w:t>
-      </w:r>
-      <w:r>
-        <w:rPr>
-          <w:rFonts w:ascii="Times New Roman" w:eastAsia="Times New Roman" w:hAnsi="Times New Roman" w:cs="Times New Roman"/>
-          <w:sz w:val="24"/>
-          <w:szCs w:val="24"/>
-        </w:rPr>
-        <w:t xml:space="preserve"> Other:</w:t>
+      <w:r>
+        <w:rPr>
+          <w:rFonts w:ascii="Times New Roman" w:eastAsia="Times New Roman" w:hAnsi="Times New Roman" w:cs="Times New Roman"/>
+          <w:sz w:val="24"/>
+          <w:szCs w:val="24"/>
+        </w:rPr>
+        <w:t>Other:</w:t>
       </w:r>
       <w:r>
         <w:rPr>
@@ -2868,9 +3852,9 @@
 <file path=word/numbering.xml><?xml version="1.0" encoding="utf-8"?>
 <w:numbering xmlns:wpc="http://schemas.microsoft.com/office/word/2010/wordprocessingCanvas" xmlns:cx="http://schemas.microsoft.com/office/drawing/2014/chartex" xmlns:cx1="http://schemas.microsoft.com/office/drawing/2015/9/8/chartex" xmlns:cx2="http://schemas.microsoft.com/office/drawing/2015/10/21/chartex" xmlns:cx3="http://schemas.microsoft.com/office/drawing/2016/5/9/chartex" xmlns:cx4="http://schemas.microsoft.com/office/drawing/2016/5/10/chartex" xmlns:cx5="http://schemas.microsoft.com/office/drawing/2016/5/11/chartex" xmlns:cx6="http://schemas.microsoft.com/office/drawing/2016/5/12/chartex" xmlns:cx7="http://schemas.microsoft.com/office/drawing/2016/5/13/chartex" xmlns:cx8="http://schemas.microsoft.com/office/drawing/2016/5/14/chartex" xmlns:mc="http://schemas.openxmlformats.org/markup-compatibility/2006" xmlns:aink="http://schemas.microsoft.com/office/drawing/2016/ink" xmlns:am3d="http://schemas.microsoft.com/office/drawing/2017/model3d" xmlns:o="urn:schemas-microsoft-com:office:office" xmlns:oel="http://schemas.microsoft.com/office/2019/extlst" xmlns:r="http://schemas.openxmlformats.org/officeDocument/2006/relationships" xmlns:m="http://schemas.openxmlformats.org/officeDocument/2006/math" xmlns:v="urn:schemas-microsoft-com:vml" xmlns:wp14="http://schemas.microsoft.com/office/word/2010/wordprocessingDrawing" xmlns:wp="http://schemas.openxmlformats.org/drawingml/2006/wordprocessingDrawing" xmlns:w10="urn:schemas-microsoft-com:office:word" xmlns:w="http://schemas.openxmlformats.org/wordprocessingml/2006/main" xmlns:w14="http://schemas.microsoft.com/office/word/2010/wordml" xmlns:w15="http://schemas.microsoft.com/office/word/2012/wordml" xmlns:w16cex="http://schemas.microsoft.com/office/word/2018/wordml/cex" xmlns:w16cid="http://schemas.microsoft.com/office/word/2016/wordml/cid" xmlns:w16="http://schemas.microsoft.com/office/word/2018/wordml" xmlns:w16du="http://schemas.microsoft.com/office/word/2023/wordml/word16du" xmlns:w16sdtdh="http://schemas.microsoft.com/office/word/2020/wordml/sdtdatahash" xmlns:w16sdtfl="http://schemas.microsoft.com/office/word/2024/wordml/sdtformatlock" xmlns:w16se="http://schemas.microsoft.com/office/word/2015/wordml/symex" xmlns:wpg="http://schemas.microsoft.com/office/word/2010/wordprocessingGroup" xmlns:wpi="http://schemas.microsoft.com/office/word/2010/wordprocessingInk" xmlns:wne="http://schemas.microsoft.com/office/word/2006/wordml" xmlns:wps="http://schemas.microsoft.com/office/word/2010/wordprocessingShape" mc:Ignorable="w14 w15 w16se w16cid w16 w16cex w16sdtdh w16sdtfl w16du wp14">
   <w:abstractNum w:abstractNumId="0" w15:restartNumberingAfterBreak="0">
-    <w:nsid w:val="386D78F6"/>
+    <w:nsid w:val="17A968A2"/>
     <w:multiLevelType w:val="multilevel"/>
-    <w:tmpl w:val="B5645FAA"/>
+    <w:tmpl w:val="C450E2B0"/>
     <w:lvl w:ilvl="0">
       <w:start w:val="1"/>
       <w:numFmt w:val="bullet"/>
@@ -2981,9 +3965,9 @@
     </w:lvl>
   </w:abstractNum>
   <w:abstractNum w:abstractNumId="1" w15:restartNumberingAfterBreak="0">
-    <w:nsid w:val="47B23D4A"/>
+    <w:nsid w:val="386D78F6"/>
     <w:multiLevelType w:val="multilevel"/>
-    <w:tmpl w:val="100AA920"/>
+    <w:tmpl w:val="B5645FAA"/>
     <w:lvl w:ilvl="0">
       <w:start w:val="1"/>
       <w:numFmt w:val="bullet"/>
@@ -3093,11 +4077,127 @@
       </w:rPr>
     </w:lvl>
   </w:abstractNum>
+  <w:abstractNum w:abstractNumId="2" w15:restartNumberingAfterBreak="0">
+    <w:nsid w:val="47B23D4A"/>
+    <w:multiLevelType w:val="multilevel"/>
+    <w:tmpl w:val="100AA920"/>
+    <w:lvl w:ilvl="0">
+      <w:start w:val="1"/>
+      <w:numFmt w:val="bullet"/>
+      <w:lvlText w:val="●"/>
+      <w:lvlJc w:val="left"/>
+      <w:pPr>
+        <w:ind w:left="720" w:hanging="360"/>
+      </w:pPr>
+      <w:rPr>
+        <w:u w:val="none"/>
+      </w:rPr>
+    </w:lvl>
+    <w:lvl w:ilvl="1">
+      <w:start w:val="1"/>
+      <w:numFmt w:val="bullet"/>
+      <w:lvlText w:val="●"/>
+      <w:lvlJc w:val="left"/>
+      <w:pPr>
+        <w:ind w:left="1440" w:hanging="360"/>
+      </w:pPr>
+      <w:rPr>
+        <w:u w:val="none"/>
+      </w:rPr>
+    </w:lvl>
+    <w:lvl w:ilvl="2">
+      <w:start w:val="1"/>
+      <w:numFmt w:val="bullet"/>
+      <w:lvlText w:val="●"/>
+      <w:lvlJc w:val="left"/>
+      <w:pPr>
+        <w:ind w:left="2160" w:hanging="360"/>
+      </w:pPr>
+      <w:rPr>
+        <w:u w:val="none"/>
+      </w:rPr>
+    </w:lvl>
+    <w:lvl w:ilvl="3">
+      <w:start w:val="1"/>
+      <w:numFmt w:val="bullet"/>
+      <w:lvlText w:val="●"/>
+      <w:lvlJc w:val="left"/>
+      <w:pPr>
+        <w:ind w:left="2880" w:hanging="360"/>
+      </w:pPr>
+      <w:rPr>
+        <w:u w:val="none"/>
+      </w:rPr>
+    </w:lvl>
+    <w:lvl w:ilvl="4">
+      <w:start w:val="1"/>
+      <w:numFmt w:val="bullet"/>
+      <w:lvlText w:val="●"/>
+      <w:lvlJc w:val="left"/>
+      <w:pPr>
+        <w:ind w:left="3600" w:hanging="360"/>
+      </w:pPr>
+      <w:rPr>
+        <w:u w:val="none"/>
+      </w:rPr>
+    </w:lvl>
+    <w:lvl w:ilvl="5">
+      <w:start w:val="1"/>
+      <w:numFmt w:val="bullet"/>
+      <w:lvlText w:val="●"/>
+      <w:lvlJc w:val="left"/>
+      <w:pPr>
+        <w:ind w:left="4320" w:hanging="360"/>
+      </w:pPr>
+      <w:rPr>
+        <w:u w:val="none"/>
+      </w:rPr>
+    </w:lvl>
+    <w:lvl w:ilvl="6">
+      <w:start w:val="1"/>
+      <w:numFmt w:val="bullet"/>
+      <w:lvlText w:val="●"/>
+      <w:lvlJc w:val="left"/>
+      <w:pPr>
+        <w:ind w:left="5040" w:hanging="360"/>
+      </w:pPr>
+      <w:rPr>
+        <w:u w:val="none"/>
+      </w:rPr>
+    </w:lvl>
+    <w:lvl w:ilvl="7">
+      <w:start w:val="1"/>
+      <w:numFmt w:val="bullet"/>
+      <w:lvlText w:val="●"/>
+      <w:lvlJc w:val="left"/>
+      <w:pPr>
+        <w:ind w:left="5760" w:hanging="360"/>
+      </w:pPr>
+      <w:rPr>
+        <w:u w:val="none"/>
+      </w:rPr>
+    </w:lvl>
+    <w:lvl w:ilvl="8">
+      <w:start w:val="1"/>
+      <w:numFmt w:val="bullet"/>
+      <w:lvlText w:val="●"/>
+      <w:lvlJc w:val="left"/>
+      <w:pPr>
+        <w:ind w:left="6480" w:hanging="360"/>
+      </w:pPr>
+      <w:rPr>
+        <w:u w:val="none"/>
+      </w:rPr>
+    </w:lvl>
+  </w:abstractNum>
   <w:num w:numId="1" w16cid:durableId="715859979">
-    <w:abstractNumId w:val="0"/>
+    <w:abstractNumId w:val="1"/>
   </w:num>
   <w:num w:numId="2" w16cid:durableId="231281802">
-    <w:abstractNumId w:val="1"/>
+    <w:abstractNumId w:val="2"/>
+  </w:num>
+  <w:num w:numId="3" w16cid:durableId="711345315">
+    <w:abstractNumId w:val="0"/>
   </w:num>
 </w:numbering>
 </file>

</xml_diff>